<commit_message>
docs: add new documentation and update gitignore
</commit_message>
<xml_diff>
--- a/Documentation/AREDN SetupV2.3-English.docx
+++ b/Documentation/AREDN SetupV2.3-English.docx
@@ -4,22 +4,22 @@
   <w:body>
     <w:p>
       <w:pPr>
-        <w:pStyle w:val="Title"/>
-      </w:pPr>
-    </w:p>
-    <w:p>
-      <w:pPr>
-        <w:pStyle w:val="Title"/>
-      </w:pPr>
-    </w:p>
-    <w:p>
-      <w:pPr>
-        <w:pStyle w:val="Title"/>
-      </w:pPr>
-    </w:p>
-    <w:p>
-      <w:pPr>
-        <w:pStyle w:val="Title"/>
+        <w:pStyle w:val="Titel"/>
+      </w:pPr>
+    </w:p>
+    <w:p>
+      <w:pPr>
+        <w:pStyle w:val="Titel"/>
+      </w:pPr>
+    </w:p>
+    <w:p>
+      <w:pPr>
+        <w:pStyle w:val="Titel"/>
+      </w:pPr>
+    </w:p>
+    <w:p>
+      <w:pPr>
+        <w:pStyle w:val="Titel"/>
         <w:jc w:val="center"/>
         <w:rPr>
           <w:sz w:val="144"/>
@@ -158,7 +158,7 @@
       <w:sdtContent>
         <w:p>
           <w:pPr>
-            <w:pStyle w:val="TOCHeading"/>
+            <w:pStyle w:val="Inhaltsverzeichnisberschrift"/>
           </w:pPr>
           <w:r>
             <w:t>Content</w:t>
@@ -166,7 +166,7 @@
         </w:p>
         <w:p>
           <w:pPr>
-            <w:pStyle w:val="TOC1"/>
+            <w:pStyle w:val="Verzeichnis1"/>
             <w:tabs>
               <w:tab w:val="right" w:leader="dot" w:pos="9350"/>
             </w:tabs>
@@ -251,7 +251,7 @@
         </w:p>
         <w:p>
           <w:pPr>
-            <w:pStyle w:val="TOC1"/>
+            <w:pStyle w:val="Verzeichnis1"/>
             <w:tabs>
               <w:tab w:val="right" w:leader="dot" w:pos="9350"/>
             </w:tabs>
@@ -324,7 +324,7 @@
         </w:p>
         <w:p>
           <w:pPr>
-            <w:pStyle w:val="TOC2"/>
+            <w:pStyle w:val="Verzeichnis2"/>
             <w:tabs>
               <w:tab w:val="right" w:leader="dot" w:pos="9350"/>
             </w:tabs>
@@ -396,7 +396,7 @@
         </w:p>
         <w:p>
           <w:pPr>
-            <w:pStyle w:val="TOC2"/>
+            <w:pStyle w:val="Verzeichnis2"/>
             <w:tabs>
               <w:tab w:val="right" w:leader="dot" w:pos="9350"/>
             </w:tabs>
@@ -469,7 +469,7 @@
         </w:p>
         <w:p>
           <w:pPr>
-            <w:pStyle w:val="TOC3"/>
+            <w:pStyle w:val="Verzeichnis3"/>
             <w:tabs>
               <w:tab w:val="right" w:leader="dot" w:pos="9350"/>
             </w:tabs>
@@ -541,7 +541,7 @@
         </w:p>
         <w:p>
           <w:pPr>
-            <w:pStyle w:val="TOC3"/>
+            <w:pStyle w:val="Verzeichnis3"/>
             <w:tabs>
               <w:tab w:val="right" w:leader="dot" w:pos="9350"/>
             </w:tabs>
@@ -613,7 +613,7 @@
         </w:p>
         <w:p>
           <w:pPr>
-            <w:pStyle w:val="TOC1"/>
+            <w:pStyle w:val="Verzeichnis1"/>
             <w:tabs>
               <w:tab w:val="right" w:leader="dot" w:pos="9350"/>
             </w:tabs>
@@ -685,7 +685,7 @@
         </w:p>
         <w:p>
           <w:pPr>
-            <w:pStyle w:val="TOC2"/>
+            <w:pStyle w:val="Verzeichnis2"/>
             <w:tabs>
               <w:tab w:val="right" w:leader="dot" w:pos="9350"/>
             </w:tabs>
@@ -757,7 +757,7 @@
         </w:p>
         <w:p>
           <w:pPr>
-            <w:pStyle w:val="TOC2"/>
+            <w:pStyle w:val="Verzeichnis2"/>
             <w:tabs>
               <w:tab w:val="right" w:leader="dot" w:pos="9350"/>
             </w:tabs>
@@ -829,7 +829,7 @@
         </w:p>
         <w:p>
           <w:pPr>
-            <w:pStyle w:val="TOC2"/>
+            <w:pStyle w:val="Verzeichnis2"/>
             <w:tabs>
               <w:tab w:val="right" w:leader="dot" w:pos="9350"/>
             </w:tabs>
@@ -901,7 +901,7 @@
         </w:p>
         <w:p>
           <w:pPr>
-            <w:pStyle w:val="TOC2"/>
+            <w:pStyle w:val="Verzeichnis2"/>
             <w:tabs>
               <w:tab w:val="right" w:leader="dot" w:pos="9350"/>
             </w:tabs>
@@ -973,7 +973,7 @@
         </w:p>
         <w:p>
           <w:pPr>
-            <w:pStyle w:val="TOC2"/>
+            <w:pStyle w:val="Verzeichnis2"/>
             <w:tabs>
               <w:tab w:val="right" w:leader="dot" w:pos="9350"/>
             </w:tabs>
@@ -1045,7 +1045,7 @@
         </w:p>
         <w:p>
           <w:pPr>
-            <w:pStyle w:val="TOC2"/>
+            <w:pStyle w:val="Verzeichnis2"/>
             <w:tabs>
               <w:tab w:val="right" w:leader="dot" w:pos="9350"/>
             </w:tabs>
@@ -1117,7 +1117,7 @@
         </w:p>
         <w:p>
           <w:pPr>
-            <w:pStyle w:val="TOC2"/>
+            <w:pStyle w:val="Verzeichnis2"/>
             <w:tabs>
               <w:tab w:val="right" w:leader="dot" w:pos="9350"/>
             </w:tabs>
@@ -1190,7 +1190,7 @@
         </w:p>
         <w:p>
           <w:pPr>
-            <w:pStyle w:val="TOC2"/>
+            <w:pStyle w:val="Verzeichnis2"/>
             <w:tabs>
               <w:tab w:val="right" w:leader="dot" w:pos="9350"/>
             </w:tabs>
@@ -1262,7 +1262,7 @@
         </w:p>
         <w:p>
           <w:pPr>
-            <w:pStyle w:val="TOC1"/>
+            <w:pStyle w:val="Verzeichnis1"/>
             <w:tabs>
               <w:tab w:val="right" w:leader="dot" w:pos="9350"/>
             </w:tabs>
@@ -1335,7 +1335,7 @@
         </w:p>
         <w:p>
           <w:pPr>
-            <w:pStyle w:val="TOC2"/>
+            <w:pStyle w:val="Verzeichnis2"/>
             <w:tabs>
               <w:tab w:val="right" w:leader="dot" w:pos="9350"/>
             </w:tabs>
@@ -1408,7 +1408,7 @@
         </w:p>
         <w:p>
           <w:pPr>
-            <w:pStyle w:val="TOC2"/>
+            <w:pStyle w:val="Verzeichnis2"/>
             <w:tabs>
               <w:tab w:val="right" w:leader="dot" w:pos="9350"/>
             </w:tabs>
@@ -1481,7 +1481,7 @@
         </w:p>
         <w:p>
           <w:pPr>
-            <w:pStyle w:val="TOC2"/>
+            <w:pStyle w:val="Verzeichnis2"/>
             <w:tabs>
               <w:tab w:val="right" w:leader="dot" w:pos="9350"/>
             </w:tabs>
@@ -1554,7 +1554,7 @@
         </w:p>
         <w:p>
           <w:pPr>
-            <w:pStyle w:val="TOC3"/>
+            <w:pStyle w:val="Verzeichnis3"/>
             <w:tabs>
               <w:tab w:val="right" w:leader="dot" w:pos="9350"/>
             </w:tabs>
@@ -1627,7 +1627,7 @@
         </w:p>
         <w:p>
           <w:pPr>
-            <w:pStyle w:val="TOC3"/>
+            <w:pStyle w:val="Verzeichnis3"/>
             <w:tabs>
               <w:tab w:val="right" w:leader="dot" w:pos="9350"/>
             </w:tabs>
@@ -1700,7 +1700,7 @@
         </w:p>
         <w:p>
           <w:pPr>
-            <w:pStyle w:val="TOC2"/>
+            <w:pStyle w:val="Verzeichnis2"/>
             <w:tabs>
               <w:tab w:val="right" w:leader="dot" w:pos="9350"/>
             </w:tabs>
@@ -1773,7 +1773,7 @@
         </w:p>
         <w:p>
           <w:pPr>
-            <w:pStyle w:val="TOC1"/>
+            <w:pStyle w:val="Verzeichnis1"/>
             <w:tabs>
               <w:tab w:val="right" w:leader="dot" w:pos="9350"/>
             </w:tabs>
@@ -1846,7 +1846,7 @@
         </w:p>
         <w:p>
           <w:pPr>
-            <w:pStyle w:val="TOC2"/>
+            <w:pStyle w:val="Verzeichnis2"/>
             <w:tabs>
               <w:tab w:val="right" w:leader="dot" w:pos="9350"/>
             </w:tabs>
@@ -1936,7 +1936,7 @@
     </w:sdt>
     <w:p>
       <w:pPr>
-        <w:pStyle w:val="Heading1"/>
+        <w:pStyle w:val="berschrift1"/>
         <w:rPr>
           <w:lang w:val="en-GB"/>
         </w:rPr>
@@ -1988,21 +1988,7 @@
             <w:rStyle w:val="Hyperlink"/>
             <w:lang w:val="en-GB"/>
           </w:rPr>
-          <w:t>swissdigitaln</w:t>
-        </w:r>
-        <w:r>
-          <w:rPr>
-            <w:rStyle w:val="Hyperlink"/>
-            <w:lang w:val="en-GB"/>
-          </w:rPr>
-          <w:t>e</w:t>
-        </w:r>
-        <w:r>
-          <w:rPr>
-            <w:rStyle w:val="Hyperlink"/>
-            <w:lang w:val="en-GB"/>
-          </w:rPr>
-          <w:t>t</w:t>
+          <w:t>swissdigitalnet</w:t>
         </w:r>
         <w:r>
           <w:rPr>
@@ -2382,7 +2368,7 @@
     </w:p>
     <w:p>
       <w:pPr>
-        <w:pStyle w:val="Heading1"/>
+        <w:pStyle w:val="berschrift1"/>
         <w:rPr>
           <w:lang w:val="en-GB"/>
         </w:rPr>
@@ -2405,7 +2391,7 @@
     </w:p>
     <w:p>
       <w:pPr>
-        <w:pStyle w:val="Heading2"/>
+        <w:pStyle w:val="berschrift2"/>
       </w:pPr>
       <w:bookmarkStart w:id="2" w:name="_Toc182639061"/>
       <w:r>
@@ -2732,34 +2718,13 @@
         <w:t xml:space="preserve">Power the Yealink with the speaker button pressed </w:t>
       </w:r>
       <w:r>
-        <w:t xml:space="preserve">until you see a </w:t>
-      </w:r>
-      <w:proofErr w:type="gramStart"/>
-      <w:r>
-        <w:t>selection(</w:t>
-      </w:r>
-      <w:proofErr w:type="gramEnd"/>
+        <w:t>until you see a selection(</w:t>
+      </w:r>
       <w:r>
         <w:t>TFTP</w:t>
       </w:r>
       <w:r>
-        <w:t xml:space="preserve"> or USB) or the </w:t>
-      </w:r>
-      <w:proofErr w:type="gramStart"/>
-      <w:r>
-        <w:t>below screen</w:t>
-      </w:r>
-      <w:proofErr w:type="gramEnd"/>
-      <w:r>
-        <w:t xml:space="preserve">. Press 1 for TFTP </w:t>
-      </w:r>
-      <w:proofErr w:type="gramStart"/>
-      <w:r>
-        <w:t>if</w:t>
-      </w:r>
-      <w:proofErr w:type="gramEnd"/>
-      <w:r>
-        <w:t xml:space="preserve"> </w:t>
+        <w:t xml:space="preserve"> or USB) or the below screen. Press 1 for TFTP if </w:t>
       </w:r>
       <w:r>
         <w:t>presented</w:t>
@@ -2788,15 +2753,7 @@
         <w:t>,</w:t>
       </w:r>
       <w:r>
-        <w:t xml:space="preserve"> </w:t>
-      </w:r>
-      <w:proofErr w:type="gramStart"/>
-      <w:r>
-        <w:t>192.168.0.230 )</w:t>
-      </w:r>
-      <w:proofErr w:type="gramEnd"/>
-      <w:r>
-        <w:t>:</w:t>
+        <w:t xml:space="preserve"> 192.168.0.230 ):</w:t>
       </w:r>
     </w:p>
     <w:p>
@@ -3079,7 +3036,7 @@
     </w:p>
     <w:p>
       <w:pPr>
-        <w:pStyle w:val="Heading2"/>
+        <w:pStyle w:val="berschrift2"/>
         <w:rPr>
           <w:lang w:val="en-GB"/>
         </w:rPr>
@@ -3633,7 +3590,7 @@
     </w:p>
     <w:p>
       <w:pPr>
-        <w:pStyle w:val="Heading3"/>
+        <w:pStyle w:val="berschrift3"/>
         <w:rPr>
           <w:lang w:val="en-GB"/>
         </w:rPr>
@@ -3654,21 +3611,12 @@
           <w:lang w:val="en-GB"/>
         </w:rPr>
       </w:pPr>
-      <w:proofErr w:type="gramStart"/>
       <w:r>
         <w:rPr>
           <w:color w:val="FF0000"/>
           <w:lang w:val="en-GB"/>
         </w:rPr>
-        <w:t>Has to</w:t>
-      </w:r>
-      <w:proofErr w:type="gramEnd"/>
-      <w:r>
-        <w:rPr>
-          <w:color w:val="FF0000"/>
-          <w:lang w:val="en-GB"/>
-        </w:rPr>
-        <w:t xml:space="preserve"> be entered manually for T42</w:t>
+        <w:t>Has to be entered manually for T42</w:t>
       </w:r>
     </w:p>
     <w:p>
@@ -3677,15 +3625,7 @@
         <w:t xml:space="preserve">SIP Server and your phone </w:t>
       </w:r>
       <w:r>
-        <w:t xml:space="preserve">numbers </w:t>
-      </w:r>
-      <w:proofErr w:type="gramStart"/>
-      <w:r>
-        <w:t>have to</w:t>
-      </w:r>
-      <w:proofErr w:type="gramEnd"/>
-      <w:r>
-        <w:t xml:space="preserve"> be</w:t>
+        <w:t>numbers have to be</w:t>
       </w:r>
       <w:r>
         <w:t xml:space="preserve"> correct</w:t>
@@ -3834,10 +3774,10 @@
           <w:noProof/>
         </w:rPr>
         <w:drawing>
-          <wp:inline distT="0" distB="0" distL="0" distR="0" wp14:anchorId="7847C364" wp14:editId="05A9A9DF">
-            <wp:extent cx="4244559" cy="1770380"/>
-            <wp:effectExtent l="0" t="0" r="3810" b="1270"/>
-            <wp:docPr id="1202010691" name="Grafik 7"/>
+          <wp:inline distT="0" distB="0" distL="0" distR="0" wp14:anchorId="45975111" wp14:editId="6F3D0134">
+            <wp:extent cx="5943600" cy="2563495"/>
+            <wp:effectExtent l="0" t="0" r="0" b="8255"/>
+            <wp:docPr id="1857845335" name="Grafik 1"/>
             <wp:cNvGraphicFramePr>
               <a:graphicFrameLocks xmlns:a="http://schemas.openxmlformats.org/drawingml/2006/main" noChangeAspect="1"/>
             </wp:cNvGraphicFramePr>
@@ -3845,7 +3785,7 @@
               <a:graphicData uri="http://schemas.openxmlformats.org/drawingml/2006/picture">
                 <pic:pic xmlns:pic="http://schemas.openxmlformats.org/drawingml/2006/picture">
                   <pic:nvPicPr>
-                    <pic:cNvPr id="1202010691" name=""/>
+                    <pic:cNvPr id="1857845335" name=""/>
                     <pic:cNvPicPr/>
                   </pic:nvPicPr>
                   <pic:blipFill>
@@ -3863,7 +3803,7 @@
                   <pic:spPr>
                     <a:xfrm>
                       <a:off x="0" y="0"/>
-                      <a:ext cx="4256885" cy="1775521"/>
+                      <a:ext cx="5943600" cy="2563495"/>
                     </a:xfrm>
                     <a:prstGeom prst="rect">
                       <a:avLst/>
@@ -3886,7 +3826,19 @@
         <w:rPr>
           <w:lang w:val="en-GB"/>
         </w:rPr>
-        <w:t>The two phonebooks for copy-paste</w:t>
+        <w:t>The phonebook</w:t>
+      </w:r>
+      <w:r>
+        <w:rPr>
+          <w:lang w:val="en-GB"/>
+        </w:rPr>
+        <w:t xml:space="preserve"> address</w:t>
+      </w:r>
+      <w:r>
+        <w:rPr>
+          <w:lang w:val="en-GB"/>
+        </w:rPr>
+        <w:t xml:space="preserve"> for copy-paste</w:t>
       </w:r>
       <w:r>
         <w:rPr>
@@ -3906,7 +3858,21 @@
           <w:color w:val="FF0000"/>
           <w:lang w:val="en-GB"/>
         </w:rPr>
-        <w:t>if they are not here</w:t>
+        <w:t xml:space="preserve">if </w:t>
+      </w:r>
+      <w:r>
+        <w:rPr>
+          <w:color w:val="FF0000"/>
+          <w:lang w:val="en-GB"/>
+        </w:rPr>
+        <w:t>it is</w:t>
+      </w:r>
+      <w:r>
+        <w:rPr>
+          <w:color w:val="FF0000"/>
+          <w:lang w:val="en-GB"/>
+        </w:rPr>
+        <w:t xml:space="preserve"> not here</w:t>
       </w:r>
       <w:r>
         <w:rPr>
@@ -3921,93 +3887,42 @@
         <w:t>:</w:t>
       </w:r>
     </w:p>
-    <w:p>
-      <w:bookmarkStart w:id="5" w:name="_Toc182639063"/>
-      <w:bookmarkStart w:id="6" w:name="_Hlk171412430"/>
-      <w:r>
-        <w:t>Standard phone book</w:t>
-      </w:r>
-      <w:bookmarkEnd w:id="5"/>
-      <w:r>
-        <w:t>:</w:t>
-      </w:r>
-    </w:p>
-    <w:p>
-      <w:hyperlink r:id="rId23" w:history="1">
-        <w:r>
-          <w:rPr>
-            <w:rStyle w:val="Hyperlink"/>
-          </w:rPr>
-          <w:t>http://localnode.local.mesh:8081/phonebook?format=PBX&amp;target=generic&amp;ia=true</w:t>
-        </w:r>
-      </w:hyperlink>
-    </w:p>
-    <w:p>
-      <w:r>
-        <w:t>This file</w:t>
-      </w:r>
-      <w:r>
-        <w:t xml:space="preserve"> only</w:t>
-      </w:r>
-      <w:r>
-        <w:t xml:space="preserve"> stores the telephone number. </w:t>
-      </w:r>
-      <w:r>
-        <w:t xml:space="preserve">The PBX </w:t>
-      </w:r>
-      <w:r>
-        <w:t>knows this number</w:t>
-      </w:r>
-      <w:r>
-        <w:t xml:space="preserve"> anyway</w:t>
-      </w:r>
-      <w:r>
-        <w:t xml:space="preserve">, and the SIP server </w:t>
-      </w:r>
-      <w:r>
-        <w:t xml:space="preserve">in the phonebook program </w:t>
-      </w:r>
-      <w:r>
-        <w:t>automatically creates the mesh address for direct calling.</w:t>
-      </w:r>
-    </w:p>
-    <w:p>
-      <w:bookmarkStart w:id="7" w:name="_Toc182639064"/>
-      <w:r>
-        <w:t>Backup phonebook (with full mesh address)</w:t>
-      </w:r>
-      <w:bookmarkEnd w:id="7"/>
-      <w:r>
-        <w:t>:</w:t>
-      </w:r>
-    </w:p>
-    <w:p>
-      <w:r>
-        <w:t>If you want to store the full mesh address as a backup on your phone, you can add the second line. It is not needed.</w:t>
-      </w:r>
-    </w:p>
-    <w:p>
-      <w:hyperlink r:id="rId24" w:history="1">
-        <w:r>
-          <w:rPr>
-            <w:rStyle w:val="Hyperlink"/>
-          </w:rPr>
-          <w:t>http://localnode.local.mesh:8081/phonebook?format=direct&amp;target=generic&amp;ia=true</w:t>
-        </w:r>
-      </w:hyperlink>
-    </w:p>
-    <w:bookmarkEnd w:id="6"/>
-    <w:p>
-      <w:pPr>
-        <w:rPr>
-          <w:lang w:val="en-GB"/>
-        </w:rPr>
-      </w:pPr>
-      <w:r>
-        <w:rPr>
-          <w:lang w:val="en-GB"/>
-        </w:rPr>
-        <w:t>G</w:t>
+    <w:bookmarkStart w:id="5" w:name="_Hlk171412430"/>
+    <w:p>
+      <w:r>
+        <w:fldChar w:fldCharType="begin"/>
+      </w:r>
+      <w:r>
+        <w:instrText>HYPERLINK "</w:instrText>
+      </w:r>
+      <w:r>
+        <w:instrText>http://localnode.local.mesh/arednstack/phonebook_generic_direct.xml</w:instrText>
+      </w:r>
+      <w:r>
+        <w:instrText>"</w:instrText>
+      </w:r>
+      <w:r>
+        <w:fldChar w:fldCharType="separate"/>
+      </w:r>
+      <w:r>
+        <w:rPr>
+          <w:rStyle w:val="Hyperlink"/>
+        </w:rPr>
+        <w:t>http://localnode.local.mesh/arednstack/phonebook_generic_direct.xml</w:t>
+      </w:r>
+      <w:r>
+        <w:fldChar w:fldCharType="end"/>
+      </w:r>
+    </w:p>
+    <w:bookmarkEnd w:id="5"/>
+    <w:p>
+      <w:pPr>
+        <w:rPr>
+          <w:lang w:val="en-GB"/>
+        </w:rPr>
+      </w:pPr>
+      <w:r>
+        <w:t>Next g</w:t>
       </w:r>
       <w:r>
         <w:rPr>
@@ -4082,7 +3997,7 @@
                     <pic:cNvPicPr/>
                   </pic:nvPicPr>
                   <pic:blipFill>
-                    <a:blip r:embed="rId25"/>
+                    <a:blip r:embed="rId23"/>
                     <a:stretch>
                       <a:fillRect/>
                     </a:stretch>
@@ -4155,13 +4070,13 @@
         <w:rPr>
           <w:lang w:val="en-GB"/>
         </w:rPr>
-        <w:t xml:space="preserve"> you should see a small phone in </w:t>
-      </w:r>
-      <w:r>
-        <w:rPr>
-          <w:lang w:val="en-GB"/>
-        </w:rPr>
-        <w:t>your phone's display that shows</w:t>
+        <w:t xml:space="preserve"> you should see a small phone </w:t>
+      </w:r>
+      <w:r>
+        <w:rPr>
+          <w:lang w:val="en-GB"/>
+        </w:rPr>
+        <w:t>icon on your phone's display, indicating</w:t>
       </w:r>
       <w:r>
         <w:rPr>
@@ -4288,7 +4203,6 @@
         <w:rPr>
           <w:lang w:val="en-GB"/>
         </w:rPr>
-        <w:lastRenderedPageBreak/>
         <w:t xml:space="preserve">If your </w:t>
       </w:r>
       <w:proofErr w:type="spellStart"/>
@@ -4320,9 +4234,9 @@
     </w:p>
     <w:p>
       <w:pPr>
-        <w:pStyle w:val="Heading1"/>
-      </w:pPr>
-      <w:bookmarkStart w:id="8" w:name="_Toc182639065"/>
+        <w:pStyle w:val="berschrift1"/>
+      </w:pPr>
+      <w:bookmarkStart w:id="6" w:name="_Toc182639065"/>
       <w:r>
         <w:lastRenderedPageBreak/>
         <w:t xml:space="preserve">Flash </w:t>
@@ -4335,20 +4249,20 @@
       <w:r>
         <w:t xml:space="preserve"> devices</w:t>
       </w:r>
-      <w:bookmarkEnd w:id="8"/>
-    </w:p>
-    <w:p>
-      <w:pPr>
-        <w:pStyle w:val="Heading2"/>
-      </w:pPr>
-      <w:bookmarkStart w:id="9" w:name="_Toc182639066"/>
+      <w:bookmarkEnd w:id="6"/>
+    </w:p>
+    <w:p>
+      <w:pPr>
+        <w:pStyle w:val="berschrift2"/>
+      </w:pPr>
+      <w:bookmarkStart w:id="7" w:name="_Toc182639066"/>
       <w:r>
         <w:t>P</w:t>
       </w:r>
       <w:r>
         <w:t>reparations</w:t>
       </w:r>
-      <w:bookmarkEnd w:id="9"/>
+      <w:bookmarkEnd w:id="7"/>
     </w:p>
     <w:p>
       <w:pPr>
@@ -4468,30 +4382,14 @@
           <w:sz w:val="20"/>
         </w:rPr>
       </w:pPr>
-      <w:hyperlink r:id="rId26" w:history="1">
+      <w:hyperlink r:id="rId24" w:history="1">
         <w:r>
           <w:rPr>
             <w:rStyle w:val="Hyperlink"/>
             <w:rFonts w:ascii="Consolas" w:hAnsi="Consolas"/>
             <w:sz w:val="20"/>
           </w:rPr>
-          <w:t>https://downloads.arednmesh.o</w:t>
-        </w:r>
-        <w:r>
-          <w:rPr>
-            <w:rStyle w:val="Hyperlink"/>
-            <w:rFonts w:ascii="Consolas" w:hAnsi="Consolas"/>
-            <w:sz w:val="20"/>
-          </w:rPr>
-          <w:t>r</w:t>
-        </w:r>
-        <w:r>
-          <w:rPr>
-            <w:rStyle w:val="Hyperlink"/>
-            <w:rFonts w:ascii="Consolas" w:hAnsi="Consolas"/>
-            <w:sz w:val="20"/>
-          </w:rPr>
-          <w:t>g/afs/www/</w:t>
+          <w:t>https://downloads.arednmesh.org/afs/www/</w:t>
         </w:r>
       </w:hyperlink>
     </w:p>
@@ -4560,7 +4458,7 @@
       <w:r>
         <w:t xml:space="preserve"> (</w:t>
       </w:r>
-      <w:hyperlink r:id="rId27" w:history="1">
+      <w:hyperlink r:id="rId25" w:history="1">
         <w:r>
           <w:rPr>
             <w:rStyle w:val="Hyperlink"/>
@@ -4609,7 +4507,7 @@
                     <pic:cNvPicPr/>
                   </pic:nvPicPr>
                   <pic:blipFill>
-                    <a:blip r:embed="rId28"/>
+                    <a:blip r:embed="rId26"/>
                     <a:stretch>
                       <a:fillRect/>
                     </a:stretch>
@@ -4681,7 +4579,7 @@
                     <pic:cNvPicPr/>
                   </pic:nvPicPr>
                   <pic:blipFill>
-                    <a:blip r:embed="rId29"/>
+                    <a:blip r:embed="rId27"/>
                     <a:stretch>
                       <a:fillRect/>
                     </a:stretch>
@@ -4733,9 +4631,9 @@
     </w:p>
     <w:p>
       <w:pPr>
-        <w:pStyle w:val="Heading2"/>
-      </w:pPr>
-      <w:bookmarkStart w:id="10" w:name="_Toc182639067"/>
+        <w:pStyle w:val="berschrift2"/>
+      </w:pPr>
+      <w:bookmarkStart w:id="8" w:name="_Toc182639067"/>
       <w:r>
         <w:t>Change PC to a fix</w:t>
       </w:r>
@@ -4745,7 +4643,7 @@
       <w:r>
         <w:t xml:space="preserve"> IP address</w:t>
       </w:r>
-      <w:bookmarkEnd w:id="10"/>
+      <w:bookmarkEnd w:id="8"/>
     </w:p>
     <w:p>
       <w:r>
@@ -4799,7 +4697,7 @@
                     <pic:cNvPicPr/>
                   </pic:nvPicPr>
                   <pic:blipFill>
-                    <a:blip r:embed="rId30"/>
+                    <a:blip r:embed="rId28"/>
                     <a:stretch>
                       <a:fillRect/>
                     </a:stretch>
@@ -4858,7 +4756,7 @@
                     <pic:cNvPicPr/>
                   </pic:nvPicPr>
                   <pic:blipFill rotWithShape="1">
-                    <a:blip r:embed="rId31"/>
+                    <a:blip r:embed="rId29"/>
                     <a:srcRect b="50316"/>
                     <a:stretch/>
                   </pic:blipFill>
@@ -4915,7 +4813,7 @@
                     <pic:cNvPicPr/>
                   </pic:nvPicPr>
                   <pic:blipFill>
-                    <a:blip r:embed="rId32"/>
+                    <a:blip r:embed="rId30"/>
                     <a:stretch>
                       <a:fillRect/>
                     </a:stretch>
@@ -4966,7 +4864,7 @@
                     <pic:cNvPicPr/>
                   </pic:nvPicPr>
                   <pic:blipFill>
-                    <a:blip r:embed="rId33"/>
+                    <a:blip r:embed="rId31"/>
                     <a:stretch>
                       <a:fillRect/>
                     </a:stretch>
@@ -5033,7 +4931,7 @@
                     <pic:cNvPicPr/>
                   </pic:nvPicPr>
                   <pic:blipFill>
-                    <a:blip r:embed="rId34"/>
+                    <a:blip r:embed="rId32"/>
                     <a:stretch>
                       <a:fillRect/>
                     </a:stretch>
@@ -5069,9 +4967,9 @@
     </w:p>
     <w:p>
       <w:pPr>
-        <w:pStyle w:val="Heading2"/>
-      </w:pPr>
-      <w:bookmarkStart w:id="11" w:name="_Toc182639068"/>
+        <w:pStyle w:val="berschrift2"/>
+      </w:pPr>
+      <w:bookmarkStart w:id="9" w:name="_Toc182639068"/>
       <w:r>
         <w:t xml:space="preserve">Flash </w:t>
       </w:r>
@@ -5089,7 +4987,7 @@
       <w:r>
         <w:t>target device</w:t>
       </w:r>
-      <w:bookmarkEnd w:id="11"/>
+      <w:bookmarkEnd w:id="9"/>
     </w:p>
     <w:p>
       <w:pPr>
@@ -5267,7 +5165,7 @@
                     <pic:cNvPicPr/>
                   </pic:nvPicPr>
                   <pic:blipFill>
-                    <a:blip r:embed="rId35"/>
+                    <a:blip r:embed="rId33"/>
                     <a:stretch>
                       <a:fillRect/>
                     </a:stretch>
@@ -5311,7 +5209,7 @@
                     <pic:cNvPicPr/>
                   </pic:nvPicPr>
                   <pic:blipFill>
-                    <a:blip r:embed="rId36"/>
+                    <a:blip r:embed="rId34"/>
                     <a:stretch>
                       <a:fillRect/>
                     </a:stretch>
@@ -5338,16 +5236,11 @@
       </w:r>
     </w:p>
     <w:p>
-      <w:proofErr w:type="gramStart"/>
       <w:r>
         <w:t xml:space="preserve">Now </w:t>
       </w:r>
       <w:r>
-        <w:t>pull</w:t>
-      </w:r>
-      <w:proofErr w:type="gramEnd"/>
-      <w:r>
-        <w:t xml:space="preserve"> the power of the </w:t>
+        <w:t xml:space="preserve">pull the power of the </w:t>
       </w:r>
       <w:r>
         <w:t>target device.</w:t>
@@ -5383,11 +5276,11 @@
       <w:r>
         <w:t xml:space="preserve">Uncheck </w:t>
       </w:r>
-      <w:bookmarkStart w:id="12" w:name="_Hlk149643796"/>
+      <w:bookmarkStart w:id="10" w:name="_Hlk149643796"/>
       <w:r>
         <w:t>«Filename if user class...».</w:t>
       </w:r>
-      <w:bookmarkEnd w:id="12"/>
+      <w:bookmarkEnd w:id="10"/>
       <w:r>
         <w:t xml:space="preserve"> No </w:t>
       </w:r>
@@ -5427,7 +5320,7 @@
                     <pic:cNvPicPr/>
                   </pic:nvPicPr>
                   <pic:blipFill>
-                    <a:blip r:embed="rId37"/>
+                    <a:blip r:embed="rId35"/>
                     <a:stretch>
                       <a:fillRect/>
                     </a:stretch>
@@ -5482,12 +5375,10 @@
         <w:t xml:space="preserve">log window. Immediately after the bottom line says "Do </w:t>
       </w:r>
       <w:proofErr w:type="spellStart"/>
-      <w:proofErr w:type="gramStart"/>
       <w:r>
         <w:t>ReadFile:rb.elf</w:t>
       </w:r>
       <w:proofErr w:type="spellEnd"/>
-      <w:proofErr w:type="gramEnd"/>
       <w:r>
         <w:t xml:space="preserve"> </w:t>
       </w:r>
@@ -5546,21 +5437,7 @@
         <w:rPr>
           <w:color w:val="FF0000"/>
         </w:rPr>
-        <w:t xml:space="preserve"> you </w:t>
-      </w:r>
-      <w:proofErr w:type="gramStart"/>
-      <w:r>
-        <w:rPr>
-          <w:color w:val="FF0000"/>
-        </w:rPr>
-        <w:t>have to</w:t>
-      </w:r>
-      <w:proofErr w:type="gramEnd"/>
-      <w:r>
-        <w:rPr>
-          <w:color w:val="FF0000"/>
-        </w:rPr>
-        <w:t xml:space="preserve"> start over!</w:t>
+        <w:t xml:space="preserve"> you have to start over!</w:t>
       </w:r>
     </w:p>
     <w:p>
@@ -5665,14 +5542,14 @@
     </w:p>
     <w:p>
       <w:pPr>
-        <w:pStyle w:val="Heading2"/>
-      </w:pPr>
-      <w:bookmarkStart w:id="13" w:name="_Toc182639069"/>
-      <w:bookmarkStart w:id="14" w:name="_Hlk182423443"/>
+        <w:pStyle w:val="berschrift2"/>
+      </w:pPr>
+      <w:bookmarkStart w:id="11" w:name="_Toc182639069"/>
+      <w:bookmarkStart w:id="12" w:name="_Hlk182423443"/>
       <w:r>
         <w:t>Flash AREDN Firmware</w:t>
       </w:r>
-      <w:bookmarkEnd w:id="13"/>
+      <w:bookmarkEnd w:id="11"/>
     </w:p>
     <w:p>
       <w:r>
@@ -5682,23 +5559,7 @@
         <w:t xml:space="preserve">a </w:t>
       </w:r>
       <w:r>
-        <w:t>browser and enter 192.168.</w:t>
-      </w:r>
-      <w:proofErr w:type="gramStart"/>
-      <w:r>
-        <w:t>1.1</w:t>
-      </w:r>
-      <w:proofErr w:type="gramEnd"/>
-      <w:r>
-        <w:t xml:space="preserve">. The picture should </w:t>
-      </w:r>
-      <w:proofErr w:type="gramStart"/>
-      <w:r>
-        <w:t>look something</w:t>
-      </w:r>
-      <w:proofErr w:type="gramEnd"/>
-      <w:r>
-        <w:t xml:space="preserve"> like this.</w:t>
+        <w:t>browser and enter 192.168.1.1. The picture should look something like this.</w:t>
       </w:r>
     </w:p>
     <w:p>
@@ -5728,7 +5589,7 @@
                     <pic:cNvPicPr/>
                   </pic:nvPicPr>
                   <pic:blipFill>
-                    <a:blip r:embed="rId38"/>
+                    <a:blip r:embed="rId36"/>
                     <a:stretch>
                       <a:fillRect/>
                     </a:stretch>
@@ -5796,7 +5657,7 @@
       <w:r>
         <w:t xml:space="preserve"> </w:t>
       </w:r>
-      <w:hyperlink r:id="rId39" w:history="1">
+      <w:hyperlink r:id="rId37" w:history="1">
         <w:r>
           <w:rPr>
             <w:rStyle w:val="Hyperlink"/>
@@ -5836,7 +5697,7 @@
                     <pic:cNvPicPr/>
                   </pic:nvPicPr>
                   <pic:blipFill>
-                    <a:blip r:embed="rId40" cstate="print">
+                    <a:blip r:embed="rId38" cstate="print">
                       <a:extLst>
                         <a:ext uri="{28A0092B-C50C-407E-A947-70E740481C1C}">
                           <a14:useLocalDpi xmlns:a14="http://schemas.microsoft.com/office/drawing/2010/main" val="0"/>
@@ -5892,13 +5753,13 @@
     </w:p>
     <w:p>
       <w:pPr>
-        <w:pStyle w:val="Heading2"/>
-      </w:pPr>
-      <w:bookmarkStart w:id="15" w:name="_Toc182639070"/>
+        <w:pStyle w:val="berschrift2"/>
+      </w:pPr>
+      <w:bookmarkStart w:id="13" w:name="_Toc182639070"/>
       <w:r>
         <w:t>Configure AREDN</w:t>
       </w:r>
-      <w:bookmarkEnd w:id="15"/>
+      <w:bookmarkEnd w:id="13"/>
     </w:p>
     <w:p>
       <w:r>
@@ -5912,7 +5773,7 @@
       </w:r>
     </w:p>
     <w:p>
-      <w:hyperlink r:id="rId41" w:history="1">
+      <w:hyperlink r:id="rId39" w:history="1">
         <w:r>
           <w:rPr>
             <w:rStyle w:val="Hyperlink"/>
@@ -5923,15 +5784,7 @@
     </w:p>
     <w:p>
       <w:r>
-        <w:t xml:space="preserve">If there is no answer, the process is not yet complete. Try </w:t>
-      </w:r>
-      <w:proofErr w:type="gramStart"/>
-      <w:r>
-        <w:t>again and again</w:t>
-      </w:r>
-      <w:proofErr w:type="gramEnd"/>
-      <w:r>
-        <w:t xml:space="preserve">. If you still can't connect after 15 minutes, go back and start </w:t>
+        <w:t xml:space="preserve">If there is no answer, the process is not yet complete. Try again and again. If you still can't connect after 15 minutes, go back and start </w:t>
       </w:r>
       <w:r>
         <w:t>over</w:t>
@@ -5942,15 +5795,7 @@
     </w:p>
     <w:p>
       <w:r>
-        <w:t xml:space="preserve">The new screen should show up where you can </w:t>
-      </w:r>
-      <w:proofErr w:type="gramStart"/>
-      <w:r>
-        <w:t>login</w:t>
-      </w:r>
-      <w:proofErr w:type="gramEnd"/>
-      <w:r>
-        <w:t xml:space="preserve"> to administer the node.</w:t>
+        <w:t>The new screen should show up where you can login to administer the node.</w:t>
       </w:r>
     </w:p>
     <w:p>
@@ -5977,7 +5822,7 @@
                     <pic:cNvPicPr/>
                   </pic:nvPicPr>
                   <pic:blipFill>
-                    <a:blip r:embed="rId42" cstate="print">
+                    <a:blip r:embed="rId40" cstate="print">
                       <a:extLst>
                         <a:ext uri="{28A0092B-C50C-407E-A947-70E740481C1C}">
                           <a14:useLocalDpi xmlns:a14="http://schemas.microsoft.com/office/drawing/2010/main" val="0"/>
@@ -6048,7 +5893,7 @@
                     <pic:cNvPicPr/>
                   </pic:nvPicPr>
                   <pic:blipFill>
-                    <a:blip r:embed="rId43" cstate="print">
+                    <a:blip r:embed="rId41" cstate="print">
                       <a:extLst>
                         <a:ext uri="{28A0092B-C50C-407E-A947-70E740481C1C}">
                           <a14:useLocalDpi xmlns:a14="http://schemas.microsoft.com/office/drawing/2010/main" val="0"/>
@@ -6081,7 +5926,7 @@
           <w:color w:val="000000"/>
         </w:rPr>
       </w:pPr>
-      <w:bookmarkStart w:id="16" w:name="_Hlk149644591"/>
+      <w:bookmarkStart w:id="14" w:name="_Hlk149644591"/>
       <w:r>
         <w:rPr>
           <w:color w:val="000000"/>
@@ -6099,65 +5944,51 @@
         <w:rPr>
           <w:color w:val="000000"/>
         </w:rPr>
-        <w:t xml:space="preserve">After changes, you </w:t>
-      </w:r>
-      <w:proofErr w:type="gramStart"/>
+        <w:t>After changes, you have to commit them</w:t>
+      </w:r>
       <w:r>
         <w:rPr>
           <w:color w:val="000000"/>
         </w:rPr>
-        <w:t>have to</w:t>
-      </w:r>
-      <w:proofErr w:type="gramEnd"/>
+        <w:t>,</w:t>
+      </w:r>
       <w:r>
         <w:rPr>
           <w:color w:val="000000"/>
         </w:rPr>
-        <w:t xml:space="preserve"> commit them</w:t>
+        <w:t xml:space="preserve"> and sometimes you are asked to reboot.</w:t>
       </w:r>
       <w:r>
         <w:rPr>
           <w:color w:val="000000"/>
         </w:rPr>
-        <w:t>,</w:t>
+        <w:t xml:space="preserve"> </w:t>
       </w:r>
       <w:r>
         <w:rPr>
           <w:color w:val="000000"/>
         </w:rPr>
-        <w:t xml:space="preserve"> and sometimes you are asked to reboot.</w:t>
+        <w:t>There is no «reboot» button anymore</w:t>
       </w:r>
       <w:r>
         <w:rPr>
           <w:color w:val="000000"/>
         </w:rPr>
-        <w:t xml:space="preserve"> </w:t>
-      </w:r>
-      <w:r>
-        <w:rPr>
-          <w:color w:val="000000"/>
-        </w:rPr>
-        <w:t>There is no «reboot» button anymore</w:t>
-      </w:r>
-      <w:r>
-        <w:rPr>
-          <w:color w:val="000000"/>
-        </w:rPr>
         <w:t>.</w:t>
       </w:r>
     </w:p>
     <w:p>
       <w:pPr>
-        <w:pStyle w:val="Heading2"/>
-      </w:pPr>
-      <w:bookmarkStart w:id="17" w:name="_Toc182639071"/>
+        <w:pStyle w:val="berschrift2"/>
+      </w:pPr>
+      <w:bookmarkStart w:id="15" w:name="_Toc182639071"/>
       <w:r>
         <w:t>My recommended settings for the hap routers</w:t>
       </w:r>
       <w:r>
         <w:t xml:space="preserve"> (for the moment)</w:t>
       </w:r>
-      <w:bookmarkEnd w:id="17"/>
+      <w:bookmarkEnd w:id="15"/>
     </w:p>
     <w:p>
       <w:pPr>
@@ -6192,7 +6023,7 @@
                     <pic:cNvPicPr/>
                   </pic:nvPicPr>
                   <pic:blipFill>
-                    <a:blip r:embed="rId44" cstate="print">
+                    <a:blip r:embed="rId42" cstate="print">
                       <a:extLst>
                         <a:ext uri="{28A0092B-C50C-407E-A947-70E740481C1C}">
                           <a14:useLocalDpi xmlns:a14="http://schemas.microsoft.com/office/drawing/2010/main" val="0"/>
@@ -6235,9 +6066,9 @@
     </w:p>
     <w:p>
       <w:pPr>
-        <w:pStyle w:val="Heading2"/>
-      </w:pPr>
-      <w:bookmarkStart w:id="18" w:name="_Toc182639072"/>
+        <w:pStyle w:val="berschrift2"/>
+      </w:pPr>
+      <w:bookmarkStart w:id="16" w:name="_Toc182639072"/>
       <w:r>
         <w:rPr>
           <w:rFonts w:eastAsia="Arial Unicode MS"/>
@@ -6257,41 +6088,17 @@
         </w:rPr>
         <w:t>the network</w:t>
       </w:r>
-      <w:bookmarkEnd w:id="18"/>
+      <w:bookmarkEnd w:id="16"/>
     </w:p>
     <w:p>
       <w:r>
         <w:t>Telephones</w:t>
       </w:r>
       <w:r>
-        <w:t xml:space="preserve"> </w:t>
-      </w:r>
-      <w:proofErr w:type="gramStart"/>
-      <w:r>
-        <w:t>have to</w:t>
-      </w:r>
-      <w:proofErr w:type="gramEnd"/>
-      <w:r>
-        <w:t xml:space="preserve"> be visible to others</w:t>
-      </w:r>
-      <w:r>
-        <w:t xml:space="preserve"> The is why we </w:t>
-      </w:r>
-      <w:proofErr w:type="gramStart"/>
-      <w:r>
-        <w:t>have to</w:t>
-      </w:r>
-      <w:proofErr w:type="gramEnd"/>
-      <w:r>
-        <w:t xml:space="preserve"> reserve the address. This is done in the “LAN DHCP” area on the right. If you clock </w:t>
-      </w:r>
-      <w:proofErr w:type="gramStart"/>
-      <w:r>
-        <w:t>it</w:t>
-      </w:r>
-      <w:proofErr w:type="gramEnd"/>
-      <w:r>
-        <w:t xml:space="preserve"> you get to this screen:</w:t>
+        <w:t xml:space="preserve"> have to be visible to others</w:t>
+      </w:r>
+      <w:r>
+        <w:t xml:space="preserve"> The is why we have to reserve the address. This is done in the “LAN DHCP” area on the right. If you clock it you get to this screen:</w:t>
       </w:r>
     </w:p>
     <w:p>
@@ -6318,7 +6125,7 @@
                     <pic:cNvPicPr/>
                   </pic:nvPicPr>
                   <pic:blipFill>
-                    <a:blip r:embed="rId45" cstate="print">
+                    <a:blip r:embed="rId43" cstate="print">
                       <a:extLst>
                         <a:ext uri="{28A0092B-C50C-407E-A947-70E740481C1C}">
                           <a14:useLocalDpi xmlns:a14="http://schemas.microsoft.com/office/drawing/2010/main" val="0"/>
@@ -6353,15 +6160,7 @@
         <w:t>, it should already be visible,</w:t>
       </w:r>
       <w:r>
-        <w:t xml:space="preserve"> and you just </w:t>
-      </w:r>
-      <w:proofErr w:type="gramStart"/>
-      <w:r>
-        <w:t>have to</w:t>
-      </w:r>
-      <w:proofErr w:type="gramEnd"/>
-      <w:r>
-        <w:t xml:space="preserve"> press the “+” button. Change its name to </w:t>
+        <w:t xml:space="preserve"> and you just have to press the “+” button. Change its name to </w:t>
       </w:r>
       <w:r>
         <w:t>one of your</w:t>
@@ -6447,7 +6246,7 @@
                     <pic:cNvPicPr/>
                   </pic:nvPicPr>
                   <pic:blipFill>
-                    <a:blip r:embed="rId46" cstate="print">
+                    <a:blip r:embed="rId44" cstate="print">
                       <a:extLst>
                         <a:ext uri="{28A0092B-C50C-407E-A947-70E740481C1C}">
                           <a14:useLocalDpi xmlns:a14="http://schemas.microsoft.com/office/drawing/2010/main" val="0"/>
@@ -6527,7 +6326,7 @@
                     <pic:cNvPicPr/>
                   </pic:nvPicPr>
                   <pic:blipFill>
-                    <a:blip r:embed="rId47" cstate="print">
+                    <a:blip r:embed="rId45" cstate="print">
                       <a:extLst>
                         <a:ext uri="{28A0092B-C50C-407E-A947-70E740481C1C}">
                           <a14:useLocalDpi xmlns:a14="http://schemas.microsoft.com/office/drawing/2010/main" val="0"/>
@@ -6564,14 +6363,14 @@
     </w:p>
     <w:p>
       <w:pPr>
-        <w:pStyle w:val="Heading2"/>
-      </w:pPr>
-      <w:bookmarkStart w:id="19" w:name="_Toc182639073"/>
-      <w:bookmarkEnd w:id="16"/>
+        <w:pStyle w:val="berschrift2"/>
+      </w:pPr>
+      <w:bookmarkStart w:id="17" w:name="_Toc182639073"/>
+      <w:bookmarkEnd w:id="14"/>
       <w:r>
         <w:t>Set up a tunnel to the AREDN network</w:t>
       </w:r>
-      <w:bookmarkEnd w:id="19"/>
+      <w:bookmarkEnd w:id="17"/>
       <w:r>
         <w:t xml:space="preserve"> </w:t>
       </w:r>
@@ -6599,21 +6398,7 @@
         <w:rPr>
           <w:color w:val="000000"/>
         </w:rPr>
-        <w:t xml:space="preserve">This chapter only applies to </w:t>
-      </w:r>
-      <w:proofErr w:type="gramStart"/>
-      <w:r>
-        <w:rPr>
-          <w:color w:val="000000"/>
-        </w:rPr>
-        <w:t>the hap</w:t>
-      </w:r>
-      <w:proofErr w:type="gramEnd"/>
-      <w:r>
-        <w:rPr>
-          <w:color w:val="000000"/>
-        </w:rPr>
-        <w:t xml:space="preserve"> router</w:t>
+        <w:t>This chapter only applies to the hap router</w:t>
       </w:r>
       <w:r>
         <w:rPr>
@@ -6745,7 +6530,7 @@
                     <pic:cNvPicPr/>
                   </pic:nvPicPr>
                   <pic:blipFill>
-                    <a:blip r:embed="rId48"/>
+                    <a:blip r:embed="rId46"/>
                     <a:stretch>
                       <a:fillRect/>
                     </a:stretch>
@@ -6774,15 +6559,7 @@
         <w:t>tunnel server</w:t>
       </w:r>
       <w:r>
-        <w:t xml:space="preserve"> decides which one you </w:t>
-      </w:r>
-      <w:proofErr w:type="gramStart"/>
-      <w:r>
-        <w:t>have to</w:t>
-      </w:r>
-      <w:proofErr w:type="gramEnd"/>
-      <w:r>
-        <w:t xml:space="preserve"> use. </w:t>
+        <w:t xml:space="preserve"> decides which one you have to use. </w:t>
       </w:r>
       <w:proofErr w:type="spellStart"/>
       <w:r>
@@ -6795,23 +6572,7 @@
     </w:p>
     <w:p>
       <w:r>
-        <w:t xml:space="preserve">The tunnel owner will send you a file with the </w:t>
-      </w:r>
-      <w:proofErr w:type="gramStart"/>
-      <w:r>
-        <w:t>needed info</w:t>
-      </w:r>
-      <w:proofErr w:type="gramEnd"/>
-      <w:r>
-        <w:t xml:space="preserve">. For legacy tunnels, make sure your node name matches the one given to you by the owner. </w:t>
-      </w:r>
-      <w:proofErr w:type="gramStart"/>
-      <w:r>
-        <w:t>Otherwise</w:t>
-      </w:r>
-      <w:proofErr w:type="gramEnd"/>
-      <w:r>
-        <w:t xml:space="preserve"> it will not work.</w:t>
+        <w:t>The tunnel owner will send you a file with the needed info. For legacy tunnels, make sure your node name matches the one given to you by the owner. Otherwise it will not work.</w:t>
       </w:r>
     </w:p>
     <w:p>
@@ -6890,7 +6651,7 @@
                     <pic:cNvPicPr/>
                   </pic:nvPicPr>
                   <pic:blipFill>
-                    <a:blip r:embed="rId49"/>
+                    <a:blip r:embed="rId47"/>
                     <a:stretch>
                       <a:fillRect/>
                     </a:stretch>
@@ -6913,15 +6674,7 @@
     </w:p>
     <w:p>
       <w:r>
-        <w:t xml:space="preserve">The field “Tunnel server” is left blank for clients. </w:t>
-      </w:r>
-      <w:proofErr w:type="gramStart"/>
-      <w:r>
-        <w:t>Chose</w:t>
-      </w:r>
-      <w:proofErr w:type="gramEnd"/>
-      <w:r>
-        <w:t xml:space="preserve"> </w:t>
+        <w:t xml:space="preserve">The field “Tunnel server” is left blank for clients. Chose </w:t>
       </w:r>
       <w:proofErr w:type="spellStart"/>
       <w:r>
@@ -6956,7 +6709,7 @@
                     <pic:cNvPicPr/>
                   </pic:nvPicPr>
                   <pic:blipFill>
-                    <a:blip r:embed="rId50"/>
+                    <a:blip r:embed="rId48"/>
                     <a:stretch>
                       <a:fillRect/>
                     </a:stretch>
@@ -7001,7 +6754,7 @@
                     <pic:cNvPicPr/>
                   </pic:nvPicPr>
                   <pic:blipFill>
-                    <a:blip r:embed="rId51"/>
+                    <a:blip r:embed="rId49"/>
                     <a:stretch>
                       <a:fillRect/>
                     </a:stretch>
@@ -7024,37 +6777,13 @@
     </w:p>
     <w:p>
       <w:r>
-        <w:t xml:space="preserve">After you </w:t>
-      </w:r>
-      <w:proofErr w:type="gramStart"/>
-      <w:r>
-        <w:t>commit</w:t>
-      </w:r>
-      <w:proofErr w:type="gramEnd"/>
-      <w:r>
-        <w:t xml:space="preserve"> the </w:t>
-      </w:r>
-      <w:r>
-        <w:t>changes, you should be connected (green</w:t>
-      </w:r>
-      <w:proofErr w:type="gramStart"/>
-      <w:r>
-        <w:t>)</w:t>
-      </w:r>
-      <w:proofErr w:type="gramEnd"/>
-      <w:r>
-        <w:t xml:space="preserve"> and your network should start to populate. </w:t>
-      </w:r>
-      <w:r>
-        <w:t>You are now connected to the AREDN network. Go to «Node-</w:t>
-      </w:r>
-      <w:proofErr w:type="gramStart"/>
-      <w:r>
-        <w:t>Status» / «</w:t>
-      </w:r>
-      <w:proofErr w:type="gramEnd"/>
-      <w:r>
-        <w:t>Mesh Status» and enjoy the success.</w:t>
+        <w:t xml:space="preserve">After you commit the </w:t>
+      </w:r>
+      <w:r>
+        <w:t xml:space="preserve">changes, you should be connected (green) and your network should start to populate. </w:t>
+      </w:r>
+      <w:r>
+        <w:t>You are now connected to the AREDN network. Go to «Node-Status» / «Mesh Status» and enjoy the success.</w:t>
       </w:r>
     </w:p>
     <w:p>
@@ -7085,7 +6814,7 @@
                     <pic:cNvPicPr/>
                   </pic:nvPicPr>
                   <pic:blipFill>
-                    <a:blip r:embed="rId52"/>
+                    <a:blip r:embed="rId50"/>
                     <a:stretch>
                       <a:fillRect/>
                     </a:stretch>
@@ -7108,13 +6837,13 @@
     </w:p>
     <w:p>
       <w:pPr>
-        <w:pStyle w:val="Heading1"/>
-        <w:rPr>
-          <w:lang w:val="en-GB"/>
-        </w:rPr>
-      </w:pPr>
-      <w:bookmarkStart w:id="20" w:name="_Toc182639074"/>
-      <w:bookmarkEnd w:id="14"/>
+        <w:pStyle w:val="berschrift1"/>
+        <w:rPr>
+          <w:lang w:val="en-GB"/>
+        </w:rPr>
+      </w:pPr>
+      <w:bookmarkStart w:id="18" w:name="_Toc182639074"/>
+      <w:bookmarkEnd w:id="12"/>
       <w:r>
         <w:rPr>
           <w:lang w:val="en-GB"/>
@@ -7128,7 +6857,7 @@
         </w:rPr>
         <w:t>Phonebook</w:t>
       </w:r>
-      <w:bookmarkEnd w:id="20"/>
+      <w:bookmarkEnd w:id="18"/>
     </w:p>
     <w:p>
       <w:pPr>
@@ -7275,19 +7004,19 @@
     </w:p>
     <w:p>
       <w:pPr>
-        <w:pStyle w:val="Heading2"/>
-        <w:rPr>
-          <w:lang w:val="en-GB"/>
-        </w:rPr>
-      </w:pPr>
-      <w:bookmarkStart w:id="21" w:name="_Toc182639075"/>
+        <w:pStyle w:val="berschrift2"/>
+        <w:rPr>
+          <w:lang w:val="en-GB"/>
+        </w:rPr>
+      </w:pPr>
+      <w:bookmarkStart w:id="19" w:name="_Toc182639075"/>
       <w:r>
         <w:rPr>
           <w:lang w:val="en-GB"/>
         </w:rPr>
         <w:t>Principle of operation</w:t>
       </w:r>
-      <w:bookmarkEnd w:id="21"/>
+      <w:bookmarkEnd w:id="19"/>
     </w:p>
     <w:p>
       <w:pPr>
@@ -7348,21 +7077,7 @@
         <w:rPr>
           <w:lang w:val="en-GB"/>
         </w:rPr>
-        <w:t xml:space="preserve">AREDN is a mesh network, and we do not want to create a single point of failure. This is why the telephones get their phonebook files from the hap router they are connected to. So, a phone gets its phonebook </w:t>
-      </w:r>
-      <w:proofErr w:type="gramStart"/>
-      <w:r>
-        <w:rPr>
-          <w:lang w:val="en-GB"/>
-        </w:rPr>
-        <w:t>as long as</w:t>
-      </w:r>
-      <w:proofErr w:type="gramEnd"/>
-      <w:r>
-        <w:rPr>
-          <w:lang w:val="en-GB"/>
-        </w:rPr>
-        <w:t xml:space="preserve"> its router works.</w:t>
+        <w:t>AREDN is a mesh network, and we do not want to create a single point of failure. This is why the telephones get their phonebook files from the hap router they are connected to. So, a phone gets its phonebook as long as its router works.</w:t>
       </w:r>
     </w:p>
     <w:p>
@@ -7389,7 +7104,7 @@
         </w:rPr>
         <w:t xml:space="preserve"> like </w:t>
       </w:r>
-      <w:hyperlink r:id="rId53" w:history="1">
+      <w:hyperlink r:id="rId51" w:history="1">
         <w:r>
           <w:rPr>
             <w:rStyle w:val="Hyperlink"/>
@@ -7473,7 +7188,7 @@
         </w:rPr>
         <w:t xml:space="preserve"> Swiss AREDN phonebook (SOP) is on Google: </w:t>
       </w:r>
-      <w:hyperlink r:id="rId54" w:history="1">
+      <w:hyperlink r:id="rId52" w:history="1">
         <w:r>
           <w:rPr>
             <w:rStyle w:val="Hyperlink"/>
@@ -7622,21 +7337,7 @@
         <w:rPr>
           <w:lang w:val="en-GB"/>
         </w:rPr>
-        <w:t xml:space="preserve">with 041 (e.g. 041441530). For your comfort, you only </w:t>
-      </w:r>
-      <w:proofErr w:type="gramStart"/>
-      <w:r>
-        <w:rPr>
-          <w:lang w:val="en-GB"/>
-        </w:rPr>
-        <w:t>have to</w:t>
-      </w:r>
-      <w:proofErr w:type="gramEnd"/>
-      <w:r>
-        <w:rPr>
-          <w:lang w:val="en-GB"/>
-        </w:rPr>
-        <w:t xml:space="preserve"> dial the short number (in Switzerland, 441530). The SIP server </w:t>
+        <w:t xml:space="preserve">with 041 (e.g. 041441530). For your comfort, you only have to dial the short number (in Switzerland, 441530). The SIP server </w:t>
       </w:r>
       <w:r>
         <w:rPr>
@@ -7864,20 +7565,20 @@
     </w:p>
     <w:p>
       <w:pPr>
-        <w:pStyle w:val="Heading2"/>
-        <w:rPr>
-          <w:lang w:val="en-GB"/>
-        </w:rPr>
-      </w:pPr>
-      <w:bookmarkStart w:id="22" w:name="_Toc182639076"/>
-      <w:bookmarkStart w:id="23" w:name="_Hlk150845296"/>
+        <w:pStyle w:val="berschrift2"/>
+        <w:rPr>
+          <w:lang w:val="en-GB"/>
+        </w:rPr>
+      </w:pPr>
+      <w:bookmarkStart w:id="20" w:name="_Toc182639076"/>
+      <w:bookmarkStart w:id="21" w:name="_Hlk150845296"/>
       <w:r>
         <w:rPr>
           <w:lang w:val="en-GB"/>
         </w:rPr>
         <w:t>Installation</w:t>
       </w:r>
-      <w:bookmarkEnd w:id="22"/>
+      <w:bookmarkEnd w:id="20"/>
     </w:p>
     <w:p>
       <w:pPr>
@@ -7892,8 +7593,8 @@
         <w:t>Go to the releases page and open “Assets”:</w:t>
       </w:r>
     </w:p>
-    <w:bookmarkStart w:id="24" w:name="_Hlk182638919"/>
-    <w:bookmarkStart w:id="25" w:name="_Hlk170827070"/>
+    <w:bookmarkStart w:id="22" w:name="_Hlk182638919"/>
+    <w:bookmarkStart w:id="23" w:name="_Hlk170827070"/>
     <w:p>
       <w:pPr>
         <w:pStyle w:val="Code"/>
@@ -7926,15 +7627,15 @@
         <w:fldChar w:fldCharType="end"/>
       </w:r>
     </w:p>
-    <w:bookmarkEnd w:id="24"/>
-    <w:p>
-      <w:pPr>
-        <w:rPr>
-          <w:lang w:val="en-GB"/>
-        </w:rPr>
-      </w:pPr>
-    </w:p>
-    <w:bookmarkEnd w:id="25"/>
+    <w:bookmarkEnd w:id="22"/>
+    <w:p>
+      <w:pPr>
+        <w:rPr>
+          <w:lang w:val="en-GB"/>
+        </w:rPr>
+      </w:pPr>
+    </w:p>
+    <w:bookmarkEnd w:id="23"/>
     <w:p>
       <w:pPr>
         <w:pStyle w:val="Picture"/>
@@ -7947,7 +7648,7 @@
           <w:noProof/>
         </w:rPr>
         <w:drawing>
-          <wp:inline distT="0" distB="0" distL="0" distR="0" wp14:anchorId="6FF5E2BD" wp14:editId="1CB4B96E">
+          <wp:inline distT="0" distB="0" distL="0" distR="0" wp14:anchorId="6FF5E2BD" wp14:editId="787C12E4">
             <wp:extent cx="4542079" cy="2913530"/>
             <wp:effectExtent l="0" t="0" r="0" b="1270"/>
             <wp:docPr id="971416178" name="Grafik 9"/>
@@ -7962,7 +7663,7 @@
                     <pic:cNvPicPr/>
                   </pic:nvPicPr>
                   <pic:blipFill>
-                    <a:blip r:embed="rId55" cstate="print">
+                    <a:blip r:embed="rId53" cstate="print">
                       <a:extLst>
                         <a:ext uri="{28A0092B-C50C-407E-A947-70E740481C1C}">
                           <a14:useLocalDpi xmlns:a14="http://schemas.microsoft.com/office/drawing/2010/main" val="0"/>
@@ -8073,7 +7774,7 @@
                     <pic:cNvPicPr/>
                   </pic:nvPicPr>
                   <pic:blipFill>
-                    <a:blip r:embed="rId56"/>
+                    <a:blip r:embed="rId54"/>
                     <a:stretch>
                       <a:fillRect/>
                     </a:stretch>
@@ -8147,7 +7848,7 @@
                     <pic:cNvPicPr/>
                   </pic:nvPicPr>
                   <pic:blipFill>
-                    <a:blip r:embed="rId57">
+                    <a:blip r:embed="rId55">
                       <a:extLst>
                         <a:ext uri="{28A0092B-C50C-407E-A947-70E740481C1C}">
                           <a14:useLocalDpi xmlns:a14="http://schemas.microsoft.com/office/drawing/2010/main" val="0"/>
@@ -8243,13 +7944,13 @@
     </w:p>
     <w:p>
       <w:pPr>
-        <w:pStyle w:val="Heading2"/>
-        <w:rPr>
-          <w:lang w:val="en-GB"/>
-        </w:rPr>
-      </w:pPr>
-      <w:bookmarkStart w:id="26" w:name="_Toc182639077"/>
-      <w:bookmarkStart w:id="27" w:name="_Hlk165879272"/>
+        <w:pStyle w:val="berschrift2"/>
+        <w:rPr>
+          <w:lang w:val="en-GB"/>
+        </w:rPr>
+      </w:pPr>
+      <w:bookmarkStart w:id="24" w:name="_Toc182639077"/>
+      <w:bookmarkStart w:id="25" w:name="_Hlk165879272"/>
       <w:r>
         <w:rPr>
           <w:lang w:val="en-GB"/>
@@ -8262,28 +7963,28 @@
         </w:rPr>
         <w:t>:</w:t>
       </w:r>
+      <w:bookmarkEnd w:id="24"/>
+    </w:p>
+    <w:p>
+      <w:pPr>
+        <w:pStyle w:val="berschrift3"/>
+        <w:rPr>
+          <w:lang w:val="en-GB"/>
+        </w:rPr>
+      </w:pPr>
+      <w:bookmarkStart w:id="26" w:name="_Toc182639078"/>
+      <w:bookmarkStart w:id="27" w:name="_Hlk182425524"/>
+      <w:bookmarkStart w:id="28" w:name="_Hlk165879305"/>
+      <w:bookmarkEnd w:id="25"/>
+      <w:r>
+        <w:rPr>
+          <w:lang w:val="en-GB"/>
+        </w:rPr>
+        <w:t>Is the phonebook downloaded?</w:t>
+      </w:r>
       <w:bookmarkEnd w:id="26"/>
     </w:p>
-    <w:p>
-      <w:pPr>
-        <w:pStyle w:val="Heading3"/>
-        <w:rPr>
-          <w:lang w:val="en-GB"/>
-        </w:rPr>
-      </w:pPr>
-      <w:bookmarkStart w:id="28" w:name="_Toc182639078"/>
-      <w:bookmarkStart w:id="29" w:name="_Hlk182425524"/>
-      <w:bookmarkStart w:id="30" w:name="_Hlk165879305"/>
-      <w:bookmarkEnd w:id="27"/>
-      <w:r>
-        <w:rPr>
-          <w:lang w:val="en-GB"/>
-        </w:rPr>
-        <w:t>Is the phonebook downloaded?</w:t>
-      </w:r>
-      <w:bookmarkEnd w:id="28"/>
-    </w:p>
-    <w:bookmarkStart w:id="31" w:name="_Hlk171415362"/>
+    <w:bookmarkStart w:id="29" w:name="_Hlk171415362"/>
     <w:p>
       <w:pPr>
         <w:pStyle w:val="Code"/>
@@ -8303,21 +8004,12 @@
       <w:r>
         <w:fldChar w:fldCharType="separate"/>
       </w:r>
-      <w:proofErr w:type="gramStart"/>
       <w:r>
         <w:rPr>
           <w:rStyle w:val="Hyperlink"/>
           <w:lang w:val="en-US"/>
         </w:rPr>
-        <w:t>localnode.local</w:t>
-      </w:r>
-      <w:proofErr w:type="gramEnd"/>
-      <w:r>
-        <w:rPr>
-          <w:rStyle w:val="Hyperlink"/>
-          <w:lang w:val="en-US"/>
-        </w:rPr>
-        <w:t>.mesh:8081/phonebook?format=direct&amp;target=generic&amp;ia</w:t>
+        <w:t>localnode.local.mesh:8081/phonebook?format=direct&amp;target=generic&amp;ia</w:t>
       </w:r>
       <w:r>
         <w:rPr>
@@ -8377,7 +8069,7 @@
                     <pic:cNvPicPr/>
                   </pic:nvPicPr>
                   <pic:blipFill>
-                    <a:blip r:embed="rId58"/>
+                    <a:blip r:embed="rId56"/>
                     <a:stretch>
                       <a:fillRect/>
                     </a:stretch>
@@ -8423,8 +8115,8 @@
         <w:t>:</w:t>
       </w:r>
     </w:p>
-    <w:bookmarkStart w:id="32" w:name="_Hlk171415399"/>
-    <w:bookmarkEnd w:id="31"/>
+    <w:bookmarkStart w:id="30" w:name="_Hlk171415399"/>
+    <w:bookmarkEnd w:id="29"/>
     <w:p>
       <w:pPr>
         <w:pStyle w:val="Code"/>
@@ -8444,21 +8136,12 @@
       <w:r>
         <w:fldChar w:fldCharType="separate"/>
       </w:r>
-      <w:proofErr w:type="gramStart"/>
       <w:r>
         <w:rPr>
           <w:rStyle w:val="Hyperlink"/>
           <w:lang w:val="en-GB"/>
         </w:rPr>
-        <w:t>localnode.local</w:t>
-      </w:r>
-      <w:proofErr w:type="gramEnd"/>
-      <w:r>
-        <w:rPr>
-          <w:rStyle w:val="Hyperlink"/>
-          <w:lang w:val="en-GB"/>
-        </w:rPr>
-        <w:t>.mesh:8081/reload</w:t>
+        <w:t>localnode.local.mesh:8081/reload</w:t>
       </w:r>
       <w:r>
         <w:rPr>
@@ -8505,7 +8188,7 @@
                     <pic:cNvPicPr/>
                   </pic:nvPicPr>
                   <pic:blipFill>
-                    <a:blip r:embed="rId59"/>
+                    <a:blip r:embed="rId57"/>
                     <a:stretch>
                       <a:fillRect/>
                     </a:stretch>
@@ -8528,13 +8211,13 @@
     </w:p>
     <w:p>
       <w:pPr>
-        <w:pStyle w:val="Heading3"/>
-        <w:rPr>
-          <w:lang w:val="en-GB"/>
-        </w:rPr>
-      </w:pPr>
-      <w:bookmarkStart w:id="33" w:name="_Toc182639079"/>
-      <w:bookmarkEnd w:id="29"/>
+        <w:pStyle w:val="berschrift3"/>
+        <w:rPr>
+          <w:lang w:val="en-GB"/>
+        </w:rPr>
+      </w:pPr>
+      <w:bookmarkStart w:id="31" w:name="_Toc182639079"/>
+      <w:bookmarkEnd w:id="27"/>
       <w:r>
         <w:rPr>
           <w:lang w:val="en-GB"/>
@@ -8547,7 +8230,7 @@
         </w:rPr>
         <w:t xml:space="preserve"> (only for experts)</w:t>
       </w:r>
-      <w:bookmarkEnd w:id="33"/>
+      <w:bookmarkEnd w:id="31"/>
     </w:p>
     <w:p>
       <w:pPr>
@@ -8569,7 +8252,7 @@
           <w:lang w:val="en-GB"/>
         </w:rPr>
       </w:pPr>
-      <w:bookmarkStart w:id="34" w:name="_Hlk170827326"/>
+      <w:bookmarkStart w:id="32" w:name="_Hlk170827326"/>
       <w:r>
         <w:rPr>
           <w:lang w:val="en-GB"/>
@@ -8605,7 +8288,7 @@
       </w:r>
       <w:proofErr w:type="spellEnd"/>
     </w:p>
-    <w:bookmarkEnd w:id="34"/>
+    <w:bookmarkEnd w:id="32"/>
     <w:p>
       <w:pPr>
         <w:rPr>
@@ -8745,19 +8428,11 @@
         <w:t>: "</w:t>
       </w:r>
       <w:proofErr w:type="spellStart"/>
-      <w:proofErr w:type="gramStart"/>
-      <w:r>
-        <w:rPr>
-          <w:lang w:val="en-GB"/>
-        </w:rPr>
-        <w:t>pbx,direct</w:t>
-      </w:r>
-      <w:proofErr w:type="gramEnd"/>
-      <w:r>
-        <w:rPr>
-          <w:lang w:val="en-GB"/>
-        </w:rPr>
-        <w:t>,combined</w:t>
+      <w:r>
+        <w:rPr>
+          <w:lang w:val="en-GB"/>
+        </w:rPr>
+        <w:t>pbx,direct,combined</w:t>
       </w:r>
       <w:proofErr w:type="spellEnd"/>
       <w:r>
@@ -8868,49 +8543,33 @@
         <w:t xml:space="preserve">  - Supported: </w:t>
       </w:r>
       <w:proofErr w:type="spellStart"/>
-      <w:proofErr w:type="gramStart"/>
-      <w:r>
-        <w:rPr>
-          <w:lang w:val="en-GB"/>
-        </w:rPr>
-        <w:t>generic,yealink</w:t>
-      </w:r>
-      <w:proofErr w:type="gramEnd"/>
-      <w:r>
-        <w:rPr>
-          <w:lang w:val="en-GB"/>
-        </w:rPr>
-        <w:t>,</w:t>
-      </w:r>
-      <w:proofErr w:type="gramStart"/>
-      <w:r>
-        <w:rPr>
-          <w:lang w:val="en-GB"/>
-        </w:rPr>
-        <w:t>cisco,snom</w:t>
+      <w:r>
+        <w:rPr>
+          <w:lang w:val="en-GB"/>
+        </w:rPr>
+        <w:t>generic,yealink,cisco,snom</w:t>
       </w:r>
       <w:proofErr w:type="spellEnd"/>
-      <w:proofErr w:type="gramEnd"/>
-    </w:p>
-    <w:p>
-      <w:pPr>
-        <w:pStyle w:val="Heading2"/>
-        <w:rPr>
-          <w:lang w:val="en-GB"/>
-        </w:rPr>
-      </w:pPr>
-      <w:bookmarkStart w:id="35" w:name="_Toc182639080"/>
+    </w:p>
+    <w:p>
+      <w:pPr>
+        <w:pStyle w:val="berschrift2"/>
+        <w:rPr>
+          <w:lang w:val="en-GB"/>
+        </w:rPr>
+      </w:pPr>
+      <w:bookmarkStart w:id="33" w:name="_Toc182639080"/>
+      <w:bookmarkEnd w:id="28"/>
       <w:bookmarkEnd w:id="30"/>
-      <w:bookmarkEnd w:id="32"/>
       <w:r>
         <w:rPr>
           <w:lang w:val="en-GB"/>
         </w:rPr>
         <w:t>Using a PBX in parallel</w:t>
       </w:r>
-      <w:bookmarkEnd w:id="35"/>
-    </w:p>
-    <w:bookmarkEnd w:id="23"/>
+      <w:bookmarkEnd w:id="33"/>
+    </w:p>
+    <w:bookmarkEnd w:id="21"/>
     <w:p>
       <w:pPr>
         <w:rPr>
@@ -8950,12 +8609,12 @@
     </w:p>
     <w:p>
       <w:pPr>
-        <w:pStyle w:val="Heading1"/>
-        <w:rPr>
-          <w:lang w:val="en-GB"/>
-        </w:rPr>
-      </w:pPr>
-      <w:bookmarkStart w:id="36" w:name="_Hlk182425744"/>
+        <w:pStyle w:val="berschrift1"/>
+        <w:rPr>
+          <w:lang w:val="en-GB"/>
+        </w:rPr>
+      </w:pPr>
+      <w:bookmarkStart w:id="34" w:name="_Hlk182425744"/>
       <w:r>
         <w:rPr>
           <w:lang w:val="en-GB"/>
@@ -8984,7 +8643,7 @@
     </w:p>
     <w:p>
       <w:pPr>
-        <w:pStyle w:val="Heading2"/>
+        <w:pStyle w:val="berschrift2"/>
         <w:rPr>
           <w:lang w:val="en-GB"/>
         </w:rPr>
@@ -9025,35 +8684,7 @@
         <w:rPr>
           <w:lang w:val="en-GB"/>
         </w:rPr>
-        <w:t xml:space="preserve">. </w:t>
-      </w:r>
-      <w:proofErr w:type="gramStart"/>
-      <w:r>
-        <w:rPr>
-          <w:lang w:val="en-GB"/>
-        </w:rPr>
-        <w:t>So</w:t>
-      </w:r>
-      <w:proofErr w:type="gramEnd"/>
-      <w:r>
-        <w:rPr>
-          <w:lang w:val="en-GB"/>
-        </w:rPr>
-        <w:t xml:space="preserve"> we can use any Raspberry to host it. My preferred solution is a Pi Zero because it is quite small. But because it has no Ethernet connector, we either </w:t>
-      </w:r>
-      <w:proofErr w:type="gramStart"/>
-      <w:r>
-        <w:rPr>
-          <w:lang w:val="en-GB"/>
-        </w:rPr>
-        <w:t>have to</w:t>
-      </w:r>
-      <w:proofErr w:type="gramEnd"/>
-      <w:r>
-        <w:rPr>
-          <w:lang w:val="en-GB"/>
-        </w:rPr>
-        <w:t xml:space="preserve"> connect it via Wi-Fi to the HAP lite, or we use one of these small USB-RJ45 cables</w:t>
+        <w:t>. So we can use any Raspberry to host it. My preferred solution is a Pi Zero because it is quite small. But because it has no Ethernet connector, we either have to connect it via Wi-Fi to the HAP lite, or we use one of these small USB-RJ45 cables</w:t>
       </w:r>
       <w:r>
         <w:rPr>
@@ -9089,7 +8720,7 @@
                     <pic:cNvPicPr/>
                   </pic:nvPicPr>
                   <pic:blipFill>
-                    <a:blip r:embed="rId60" cstate="print">
+                    <a:blip r:embed="rId58" cstate="print">
                       <a:extLst>
                         <a:ext uri="{28A0092B-C50C-407E-A947-70E740481C1C}">
                           <a14:useLocalDpi xmlns:a14="http://schemas.microsoft.com/office/drawing/2010/main" val="0"/>
@@ -9131,7 +8762,7 @@
     </w:p>
     <w:p>
       <w:pPr>
-        <w:pStyle w:val="Heading2"/>
+        <w:pStyle w:val="berschrift2"/>
         <w:rPr>
           <w:lang w:val="en-GB"/>
         </w:rPr>
@@ -9295,7 +8926,7 @@
           <w:lang w:val="en-GB"/>
         </w:rPr>
         <w:drawing>
-          <wp:inline distT="0" distB="0" distL="0" distR="0" wp14:anchorId="7D3DBD3E" wp14:editId="1F18FD28">
+          <wp:inline distT="0" distB="0" distL="0" distR="0" wp14:anchorId="7D3DBD3E" wp14:editId="6583485D">
             <wp:extent cx="2797079" cy="1977081"/>
             <wp:effectExtent l="0" t="0" r="3810" b="4445"/>
             <wp:docPr id="1943201266" name="Grafik 5"/>
@@ -9310,7 +8941,7 @@
                     <pic:cNvPicPr/>
                   </pic:nvPicPr>
                   <pic:blipFill>
-                    <a:blip r:embed="rId61" cstate="print">
+                    <a:blip r:embed="rId59" cstate="print">
                       <a:extLst>
                         <a:ext uri="{28A0092B-C50C-407E-A947-70E740481C1C}">
                           <a14:useLocalDpi xmlns:a14="http://schemas.microsoft.com/office/drawing/2010/main" val="0"/>
@@ -9451,7 +9082,7 @@
                     <pic:cNvPicPr/>
                   </pic:nvPicPr>
                   <pic:blipFill>
-                    <a:blip r:embed="rId62">
+                    <a:blip r:embed="rId60">
                       <a:extLst>
                         <a:ext uri="{28A0092B-C50C-407E-A947-70E740481C1C}">
                           <a14:useLocalDpi xmlns:a14="http://schemas.microsoft.com/office/drawing/2010/main" val="0"/>
@@ -9532,7 +9163,7 @@
           <w:noProof/>
         </w:rPr>
         <w:drawing>
-          <wp:inline distT="0" distB="0" distL="0" distR="0" wp14:anchorId="07585120" wp14:editId="6D9F9B62">
+          <wp:inline distT="0" distB="0" distL="0" distR="0" wp14:anchorId="07585120" wp14:editId="0C20E87A">
             <wp:extent cx="5943600" cy="1901190"/>
             <wp:effectExtent l="0" t="0" r="0" b="3810"/>
             <wp:docPr id="304487127" name="Grafik 2" descr="Ein Bild, das Text, Screenshot, Software, Computersymbol enthält.&#10;&#10;KI-generierte Inhalte können fehlerhaft sein."/>
@@ -9547,7 +9178,7 @@
                     <pic:cNvPicPr/>
                   </pic:nvPicPr>
                   <pic:blipFill>
-                    <a:blip r:embed="rId63" cstate="print">
+                    <a:blip r:embed="rId61" cstate="print">
                       <a:extLst>
                         <a:ext uri="{28A0092B-C50C-407E-A947-70E740481C1C}">
                           <a14:useLocalDpi xmlns:a14="http://schemas.microsoft.com/office/drawing/2010/main" val="0"/>
@@ -9591,7 +9222,7 @@
           <w:noProof/>
         </w:rPr>
         <w:drawing>
-          <wp:inline distT="0" distB="0" distL="0" distR="0" wp14:anchorId="0A4715F9" wp14:editId="2AD5F834">
+          <wp:inline distT="0" distB="0" distL="0" distR="0" wp14:anchorId="0A4715F9" wp14:editId="450FD9BC">
             <wp:extent cx="3216287" cy="1577561"/>
             <wp:effectExtent l="0" t="0" r="3175" b="3810"/>
             <wp:docPr id="1157853088" name="Grafik 4"/>
@@ -9606,7 +9237,7 @@
                     <pic:cNvPicPr/>
                   </pic:nvPicPr>
                   <pic:blipFill>
-                    <a:blip r:embed="rId64" cstate="print">
+                    <a:blip r:embed="rId62" cstate="print">
                       <a:extLst>
                         <a:ext uri="{28A0092B-C50C-407E-A947-70E740481C1C}">
                           <a14:useLocalDpi xmlns:a14="http://schemas.microsoft.com/office/drawing/2010/main" val="0"/>
@@ -9659,7 +9290,7 @@
                     <pic:cNvPicPr/>
                   </pic:nvPicPr>
                   <pic:blipFill>
-                    <a:blip r:embed="rId65">
+                    <a:blip r:embed="rId63">
                       <a:extLst>
                         <a:ext uri="{28A0092B-C50C-407E-A947-70E740481C1C}">
                           <a14:useLocalDpi xmlns:a14="http://schemas.microsoft.com/office/drawing/2010/main" val="0"/>
@@ -9716,7 +9347,7 @@
                     <pic:cNvPicPr/>
                   </pic:nvPicPr>
                   <pic:blipFill>
-                    <a:blip r:embed="rId66">
+                    <a:blip r:embed="rId64">
                       <a:extLst>
                         <a:ext uri="{28A0092B-C50C-407E-A947-70E740481C1C}">
                           <a14:useLocalDpi xmlns:a14="http://schemas.microsoft.com/office/drawing/2010/main" val="0"/>
@@ -9780,7 +9411,7 @@
           <w:lang w:val="en-US"/>
         </w:rPr>
       </w:pPr>
-      <w:hyperlink r:id="rId67" w:history="1">
+      <w:hyperlink r:id="rId65" w:history="1">
         <w:r>
           <w:rPr>
             <w:rStyle w:val="Hyperlink"/>
@@ -9839,7 +9470,7 @@
           <w:lang w:val="en-GB"/>
         </w:rPr>
       </w:pPr>
-      <w:hyperlink r:id="rId68" w:history="1">
+      <w:hyperlink r:id="rId66" w:history="1">
         <w:r>
           <w:rPr>
             <w:rStyle w:val="Hyperlink"/>
@@ -9878,7 +9509,7 @@
           <w:lang w:val="en-US"/>
         </w:rPr>
       </w:pPr>
-      <w:hyperlink r:id="rId69" w:history="1">
+      <w:hyperlink r:id="rId67" w:history="1">
         <w:r>
           <w:rPr>
             <w:rStyle w:val="Hyperlink"/>
@@ -9915,7 +9546,7 @@
           <w:noProof/>
         </w:rPr>
         <w:drawing>
-          <wp:inline distT="0" distB="0" distL="0" distR="0" wp14:anchorId="7E2FFF04" wp14:editId="6A611E58">
+          <wp:inline distT="0" distB="0" distL="0" distR="0" wp14:anchorId="7E2FFF04" wp14:editId="5F11B313">
             <wp:extent cx="2673603" cy="1726416"/>
             <wp:effectExtent l="0" t="0" r="0" b="7620"/>
             <wp:docPr id="754917260" name="Grafik 8"/>
@@ -9930,7 +9561,7 @@
                     <pic:cNvPicPr/>
                   </pic:nvPicPr>
                   <pic:blipFill>
-                    <a:blip r:embed="rId70" cstate="print">
+                    <a:blip r:embed="rId68" cstate="print">
                       <a:extLst>
                         <a:ext uri="{28A0092B-C50C-407E-A947-70E740481C1C}">
                           <a14:useLocalDpi xmlns:a14="http://schemas.microsoft.com/office/drawing/2010/main" val="0"/>
@@ -9959,21 +9590,13 @@
     </w:p>
     <w:p>
       <w:pPr>
-        <w:pStyle w:val="Heading2"/>
+        <w:pStyle w:val="berschrift2"/>
       </w:pPr>
       <w:r>
         <w:t>Adjustments</w:t>
       </w:r>
       <w:r>
-        <w:t xml:space="preserve"> </w:t>
-      </w:r>
-      <w:proofErr w:type="gramStart"/>
-      <w:r>
-        <w:t>on</w:t>
-      </w:r>
-      <w:proofErr w:type="gramEnd"/>
-      <w:r>
-        <w:t xml:space="preserve"> the phone</w:t>
+        <w:t xml:space="preserve"> on the phone</w:t>
       </w:r>
     </w:p>
     <w:p>
@@ -9999,7 +9622,7 @@
         </w:rPr>
         <w:lastRenderedPageBreak/>
         <w:drawing>
-          <wp:inline distT="0" distB="0" distL="0" distR="0" wp14:anchorId="0348FE9E" wp14:editId="6B34F9D4">
+          <wp:inline distT="0" distB="0" distL="0" distR="0" wp14:anchorId="0348FE9E" wp14:editId="49B926C8">
             <wp:extent cx="3838338" cy="3180982"/>
             <wp:effectExtent l="0" t="0" r="0" b="635"/>
             <wp:docPr id="1435931901" name="Grafik 11"/>
@@ -10014,7 +9637,7 @@
                     <pic:cNvPicPr/>
                   </pic:nvPicPr>
                   <pic:blipFill>
-                    <a:blip r:embed="rId71" cstate="print">
+                    <a:blip r:embed="rId69" cstate="print">
                       <a:extLst>
                         <a:ext uri="{28A0092B-C50C-407E-A947-70E740481C1C}">
                           <a14:useLocalDpi xmlns:a14="http://schemas.microsoft.com/office/drawing/2010/main" val="0"/>
@@ -10052,7 +9675,7 @@
           <w:noProof/>
         </w:rPr>
         <w:drawing>
-          <wp:inline distT="0" distB="0" distL="0" distR="0" wp14:anchorId="09B2BA76" wp14:editId="322C5E93">
+          <wp:inline distT="0" distB="0" distL="0" distR="0" wp14:anchorId="09B2BA76" wp14:editId="6F4BCB0A">
             <wp:extent cx="4046111" cy="2111240"/>
             <wp:effectExtent l="0" t="0" r="0" b="3810"/>
             <wp:docPr id="1140628998" name="Grafik 10"/>
@@ -10067,7 +9690,7 @@
                     <pic:cNvPicPr/>
                   </pic:nvPicPr>
                   <pic:blipFill>
-                    <a:blip r:embed="rId72" cstate="print">
+                    <a:blip r:embed="rId70" cstate="print">
                       <a:extLst>
                         <a:ext uri="{28A0092B-C50C-407E-A947-70E740481C1C}">
                           <a14:useLocalDpi xmlns:a14="http://schemas.microsoft.com/office/drawing/2010/main" val="0"/>
@@ -10101,7 +9724,7 @@
     </w:p>
     <w:p>
       <w:pPr>
-        <w:pStyle w:val="Heading2"/>
+        <w:pStyle w:val="berschrift2"/>
       </w:pPr>
       <w:r>
         <w:t>Installation of the package (for “professionals”)</w:t>
@@ -10119,18 +9742,10 @@
     </w:p>
     <w:p>
       <w:r>
-        <w:t xml:space="preserve">For </w:t>
-      </w:r>
-      <w:proofErr w:type="gramStart"/>
-      <w:r>
-        <w:t xml:space="preserve">the </w:t>
-      </w:r>
-      <w:r>
-        <w:t>Raspberry</w:t>
-      </w:r>
-      <w:proofErr w:type="gramEnd"/>
-      <w:r>
-        <w:t xml:space="preserve"> Pi 1 and Pi Zero</w:t>
+        <w:t xml:space="preserve">For the </w:t>
+      </w:r>
+      <w:r>
+        <w:t>Raspberry Pi 1 and Pi Zero</w:t>
       </w:r>
       <w:r>
         <w:t xml:space="preserve">, or if you want to use a </w:t>
@@ -10145,15 +9760,7 @@
         <w:t>you</w:t>
       </w:r>
       <w:r>
-        <w:t xml:space="preserve"> </w:t>
-      </w:r>
-      <w:proofErr w:type="gramStart"/>
-      <w:r>
-        <w:t>have to</w:t>
-      </w:r>
-      <w:proofErr w:type="gramEnd"/>
-      <w:r>
-        <w:t xml:space="preserve"> use</w:t>
+        <w:t xml:space="preserve"> have to use</w:t>
       </w:r>
       <w:r>
         <w:t>:</w:t>
@@ -10174,11 +9781,9 @@
       </w:r>
     </w:p>
     <w:p>
-      <w:proofErr w:type="gramStart"/>
       <w:r>
         <w:t>otherwise</w:t>
       </w:r>
-      <w:proofErr w:type="gramEnd"/>
       <w:r>
         <w:t>,</w:t>
       </w:r>
@@ -10228,52 +9833,44 @@
           <w:lang w:val="en-GB"/>
         </w:rPr>
       </w:pPr>
+      <w:r>
+        <w:rPr>
+          <w:lang w:val="en-GB"/>
+        </w:rPr>
+        <w:t>s</w:t>
+      </w:r>
+      <w:r>
+        <w:rPr>
+          <w:lang w:val="en-GB"/>
+        </w:rPr>
+        <w:t xml:space="preserve">udo </w:t>
+      </w:r>
       <w:proofErr w:type="spellStart"/>
       <w:r>
         <w:rPr>
           <w:lang w:val="en-GB"/>
         </w:rPr>
-        <w:t>s</w:t>
-      </w:r>
-      <w:r>
-        <w:rPr>
-          <w:lang w:val="en-GB"/>
-        </w:rPr>
-        <w:t>udo</w:t>
+        <w:t>dpkg</w:t>
       </w:r>
       <w:proofErr w:type="spellEnd"/>
       <w:r>
         <w:rPr>
           <w:lang w:val="en-GB"/>
         </w:rPr>
-        <w:t xml:space="preserve"> </w:t>
+        <w:t xml:space="preserve"> -</w:t>
       </w:r>
       <w:proofErr w:type="spellStart"/>
       <w:r>
         <w:rPr>
           <w:lang w:val="en-GB"/>
         </w:rPr>
-        <w:t>dpkg</w:t>
+        <w:t>i</w:t>
       </w:r>
       <w:proofErr w:type="spellEnd"/>
       <w:r>
         <w:rPr>
           <w:lang w:val="en-GB"/>
         </w:rPr>
-        <w:t xml:space="preserve"> -</w:t>
-      </w:r>
-      <w:proofErr w:type="spellStart"/>
-      <w:r>
-        <w:rPr>
-          <w:lang w:val="en-GB"/>
-        </w:rPr>
-        <w:t>i</w:t>
-      </w:r>
-      <w:proofErr w:type="spellEnd"/>
-      <w:r>
-        <w:rPr>
-          <w:lang w:val="en-GB"/>
-        </w:rPr>
         <w:t xml:space="preserve"> phonebook_arm</w:t>
       </w:r>
       <w:r>
@@ -10310,19 +9907,11 @@
           <w:lang w:val="en-GB"/>
         </w:rPr>
       </w:pPr>
-      <w:proofErr w:type="spellStart"/>
-      <w:r>
-        <w:rPr>
-          <w:lang w:val="en-GB"/>
-        </w:rPr>
-        <w:t>sudo</w:t>
-      </w:r>
-      <w:proofErr w:type="spellEnd"/>
-      <w:r>
-        <w:rPr>
-          <w:lang w:val="en-GB"/>
-        </w:rPr>
-        <w:t xml:space="preserve"> </w:t>
+      <w:r>
+        <w:rPr>
+          <w:lang w:val="en-GB"/>
+        </w:rPr>
+        <w:t xml:space="preserve">sudo </w:t>
       </w:r>
       <w:proofErr w:type="spellStart"/>
       <w:r>
@@ -10474,14 +10063,14 @@
     </w:p>
     <w:p>
       <w:pPr>
-        <w:pStyle w:val="Heading1"/>
-        <w:rPr>
-          <w:lang w:val="en-GB"/>
-        </w:rPr>
-      </w:pPr>
-      <w:bookmarkStart w:id="37" w:name="_Toc182639081"/>
-      <w:bookmarkStart w:id="38" w:name="_Hlk171415970"/>
-      <w:bookmarkEnd w:id="36"/>
+        <w:pStyle w:val="berschrift1"/>
+        <w:rPr>
+          <w:lang w:val="en-GB"/>
+        </w:rPr>
+      </w:pPr>
+      <w:bookmarkStart w:id="35" w:name="_Toc182639081"/>
+      <w:bookmarkStart w:id="36" w:name="_Hlk171415970"/>
+      <w:bookmarkEnd w:id="34"/>
       <w:r>
         <w:rPr>
           <w:lang w:val="en-GB"/>
@@ -10489,6 +10078,47 @@
         <w:lastRenderedPageBreak/>
         <w:t>Attachments</w:t>
       </w:r>
+      <w:bookmarkEnd w:id="35"/>
+    </w:p>
+    <w:p>
+      <w:pPr>
+        <w:rPr>
+          <w:lang w:val="en-GB"/>
+        </w:rPr>
+      </w:pPr>
+      <w:r>
+        <w:rPr>
+          <w:lang w:val="en-GB"/>
+        </w:rPr>
+        <w:t>These steps are executed on the server with the file repo.</w:t>
+      </w:r>
+    </w:p>
+    <w:p>
+      <w:pPr>
+        <w:pStyle w:val="berschrift2"/>
+        <w:rPr>
+          <w:lang w:val="en-GB"/>
+        </w:rPr>
+      </w:pPr>
+      <w:bookmarkStart w:id="37" w:name="_Toc182639082"/>
+      <w:r>
+        <w:rPr>
+          <w:lang w:val="en-GB"/>
+        </w:rPr>
+        <w:t xml:space="preserve">Google </w:t>
+      </w:r>
+      <w:r>
+        <w:rPr>
+          <w:lang w:val="en-GB"/>
+        </w:rPr>
+        <w:t>S</w:t>
+      </w:r>
+      <w:r>
+        <w:rPr>
+          <w:lang w:val="en-GB"/>
+        </w:rPr>
+        <w:t>heets replication</w:t>
+      </w:r>
       <w:bookmarkEnd w:id="37"/>
     </w:p>
     <w:p>
@@ -10501,47 +10131,6 @@
         <w:rPr>
           <w:lang w:val="en-GB"/>
         </w:rPr>
-        <w:t>These steps are executed on the server with the file repo.</w:t>
-      </w:r>
-    </w:p>
-    <w:p>
-      <w:pPr>
-        <w:pStyle w:val="Heading2"/>
-        <w:rPr>
-          <w:lang w:val="en-GB"/>
-        </w:rPr>
-      </w:pPr>
-      <w:bookmarkStart w:id="39" w:name="_Toc182639082"/>
-      <w:r>
-        <w:rPr>
-          <w:lang w:val="en-GB"/>
-        </w:rPr>
-        <w:t xml:space="preserve">Google </w:t>
-      </w:r>
-      <w:r>
-        <w:rPr>
-          <w:lang w:val="en-GB"/>
-        </w:rPr>
-        <w:t>S</w:t>
-      </w:r>
-      <w:r>
-        <w:rPr>
-          <w:lang w:val="en-GB"/>
-        </w:rPr>
-        <w:t>heets replication</w:t>
-      </w:r>
-      <w:bookmarkEnd w:id="39"/>
-    </w:p>
-    <w:p>
-      <w:pPr>
-        <w:rPr>
-          <w:lang w:val="en-GB"/>
-        </w:rPr>
-      </w:pPr>
-      <w:r>
-        <w:rPr>
-          <w:lang w:val="en-GB"/>
-        </w:rPr>
         <w:t>Create a file</w:t>
       </w:r>
       <w:r>
@@ -10558,7 +10147,7 @@
           <w:lang w:val="en-US"/>
         </w:rPr>
       </w:pPr>
-      <w:bookmarkStart w:id="40" w:name="_Hlk171578249"/>
+      <w:bookmarkStart w:id="38" w:name="_Hlk171578249"/>
       <w:r>
         <w:rPr>
           <w:lang w:val="en-US"/>
@@ -10608,7 +10197,7 @@
       </w:r>
       <w:proofErr w:type="spellEnd"/>
     </w:p>
-    <w:bookmarkEnd w:id="40"/>
+    <w:bookmarkEnd w:id="38"/>
     <w:p>
       <w:r>
         <w:t>and insert:</w:t>
@@ -10618,231 +10207,149 @@
       <w:pPr>
         <w:pStyle w:val="Code"/>
         <w:rPr>
-          <w:lang w:val="en-US"/>
-        </w:rPr>
-      </w:pPr>
-      <w:proofErr w:type="gramStart"/>
-      <w:r>
-        <w:rPr>
-          <w:lang w:val="en-US"/>
-        </w:rPr>
-        <w:t>#!/</w:t>
-      </w:r>
-      <w:proofErr w:type="gramEnd"/>
-      <w:r>
-        <w:rPr>
-          <w:lang w:val="en-US"/>
-        </w:rPr>
-        <w:t>bin/sh</w:t>
+          <w:sz w:val="18"/>
+          <w:szCs w:val="20"/>
+        </w:rPr>
+      </w:pPr>
+      <w:r>
+        <w:rPr>
+          <w:sz w:val="18"/>
+          <w:szCs w:val="20"/>
+        </w:rPr>
+        <w:t>#!/bin/sh</w:t>
       </w:r>
     </w:p>
     <w:p>
       <w:pPr>
         <w:pStyle w:val="Code"/>
         <w:rPr>
-          <w:lang w:val="en-US"/>
-        </w:rPr>
-      </w:pPr>
-      <w:bookmarkStart w:id="41" w:name="_Hlk171490852"/>
-      <w:r>
-        <w:rPr>
-          <w:lang w:val="en-US"/>
-        </w:rPr>
-        <w:t>curl -L “https://docs.google.com/spreadsheets/d/e/2PACX-1vTZw1cwlV6pdFETvC-JnI0gPwKRwR0rBUc2XqX9V3LV1NfrB0zvhhWKmrYVS1eippbs91lMLfkeXj6-/pub?gid=0&amp;single=true&amp;output=csv” -o /www/</w:t>
+          <w:sz w:val="18"/>
+          <w:szCs w:val="20"/>
+        </w:rPr>
+      </w:pPr>
+      <w:r>
+        <w:rPr>
+          <w:sz w:val="18"/>
+          <w:szCs w:val="20"/>
+        </w:rPr>
+        <w:t>curl -L "https://docs.google.com/spreadsheets/d/e/2PACX-1vTZw1cwlV6pdFETvC-JnI0gPwKRwR0rBUc2XqX9V3LV1NfrB0zvhhWKmrYVS1eippbs91lMLfkeXj6-/pub?gid=208565882&amp;single=true&amp;output=csv" -o /www/</w:t>
       </w:r>
       <w:proofErr w:type="spellStart"/>
       <w:r>
         <w:rPr>
-          <w:lang w:val="en-US"/>
+          <w:sz w:val="18"/>
+          <w:szCs w:val="20"/>
         </w:rPr>
         <w:t>filerepo</w:t>
       </w:r>
       <w:proofErr w:type="spellEnd"/>
       <w:r>
         <w:rPr>
-          <w:lang w:val="en-US"/>
-        </w:rPr>
-        <w:t>/Phonebook/AREDN_PhonebookV2.csv</w:t>
+          <w:sz w:val="18"/>
+          <w:szCs w:val="20"/>
+        </w:rPr>
+        <w:t>/Phonebook/AREDN_Phonebook.csv</w:t>
       </w:r>
     </w:p>
     <w:p>
       <w:pPr>
         <w:pStyle w:val="Code"/>
         <w:rPr>
-          <w:lang w:val="en-US"/>
-        </w:rPr>
-      </w:pPr>
-      <w:r>
-        <w:rPr>
-          <w:lang w:val="en-US"/>
-        </w:rPr>
-        <w:t>curl -L "https://docs.google.com/spreadsheets/d/e/2PACX-1vTZw1cwlV6pdFETvC-JnI0gPwKRwR0rBUc2XqX9V3LV1NfrB0zvhhWKmrYVS1eippbs91lMLfkeXj6-/pub?gid=0&amp;single=true&amp;output=csv" -o /www/</w:t>
+          <w:sz w:val="18"/>
+          <w:szCs w:val="20"/>
+        </w:rPr>
+      </w:pPr>
+      <w:r>
+        <w:rPr>
+          <w:sz w:val="18"/>
+          <w:szCs w:val="20"/>
+        </w:rPr>
+        <w:t>curl -L "https://docs.google.com/spreadsheets/d/e/2PACX-1vTZw1cwlV6pdFETvC-JnI0gPwKRwR0rBUc2XqX9V3LV1NfrB0zvhhWKmrYVS1eippbs91lMLfkeXj6-/pub?gid=0&amp;single=true&amp;output=csv" -o /</w:t>
       </w:r>
       <w:proofErr w:type="spellStart"/>
       <w:r>
         <w:rPr>
-          <w:lang w:val="en-US"/>
+          <w:sz w:val="18"/>
+          <w:szCs w:val="20"/>
+        </w:rPr>
+        <w:t>www</w:t>
+      </w:r>
+      <w:proofErr w:type="spellEnd"/>
+      <w:r>
+        <w:rPr>
+          <w:sz w:val="18"/>
+          <w:szCs w:val="20"/>
+        </w:rPr>
+        <w:t>/</w:t>
+      </w:r>
+      <w:proofErr w:type="spellStart"/>
+      <w:r>
+        <w:rPr>
+          <w:sz w:val="18"/>
+          <w:szCs w:val="20"/>
         </w:rPr>
         <w:t>filerepo</w:t>
       </w:r>
       <w:proofErr w:type="spellEnd"/>
       <w:r>
         <w:rPr>
-          <w:lang w:val="en-US"/>
-        </w:rPr>
-        <w:t>/Phonebook/AREDN_Phonebook.csv</w:t>
+          <w:sz w:val="18"/>
+          <w:szCs w:val="20"/>
+        </w:rPr>
+        <w:t>/</w:t>
+      </w:r>
+      <w:proofErr w:type="spellStart"/>
+      <w:r>
+        <w:rPr>
+          <w:sz w:val="18"/>
+          <w:szCs w:val="20"/>
+        </w:rPr>
+        <w:t>Phonebook</w:t>
+      </w:r>
+      <w:proofErr w:type="spellEnd"/>
+      <w:r>
+        <w:rPr>
+          <w:sz w:val="18"/>
+          <w:szCs w:val="20"/>
+        </w:rPr>
+        <w:t>/AREDN_PhonebookV2.csv</w:t>
+      </w:r>
+    </w:p>
+    <w:p/>
+    <w:p>
+      <w:r>
+        <w:t xml:space="preserve">Include the route to this phonebook repo (and eventually a backup server) to this file on all </w:t>
+      </w:r>
+      <w:r>
+        <w:t>routers with the appropriate phonebook software</w:t>
+      </w:r>
+      <w:r>
+        <w:t>:</w:t>
       </w:r>
     </w:p>
     <w:p>
       <w:pPr>
         <w:pStyle w:val="Code"/>
-        <w:rPr>
-          <w:lang w:val="en-US"/>
-        </w:rPr>
-      </w:pPr>
-      <w:r>
-        <w:rPr>
-          <w:lang w:val="en-US"/>
-        </w:rPr>
-        <w:t>curl -L “https://docs.google.com/spreadsheets/d/e/2PACX-1vTZw1cwlV6pdFETvC-JnI0gPwKRwR0rBUc2XqX9V3LV1NfrB0zvhhWKmrYVS1eippbs91lMLfkeXj6-/pub?gid=208565882&amp;single=true&amp;output=csv</w:t>
-      </w:r>
-    </w:p>
-    <w:bookmarkEnd w:id="41"/>
+      </w:pPr>
+      <w:r>
+        <w:t>vi /</w:t>
+      </w:r>
+      <w:proofErr w:type="spellStart"/>
+      <w:r>
+        <w:t>etc</w:t>
+      </w:r>
+      <w:proofErr w:type="spellEnd"/>
+      <w:r>
+        <w:t>/</w:t>
+      </w:r>
+      <w:proofErr w:type="spellStart"/>
+      <w:r>
+        <w:t>phonebook.conf</w:t>
+      </w:r>
+      <w:proofErr w:type="spellEnd"/>
+    </w:p>
     <w:p/>
-    <w:p>
-      <w:pPr>
-        <w:pStyle w:val="Code"/>
-        <w:rPr>
-          <w:sz w:val="10"/>
-          <w:szCs w:val="12"/>
-          <w:lang w:val="en-GB"/>
-        </w:rPr>
-      </w:pPr>
-      <w:proofErr w:type="gramStart"/>
-      <w:r>
-        <w:rPr>
-          <w:sz w:val="10"/>
-          <w:szCs w:val="12"/>
-          <w:lang w:val="en-GB"/>
-        </w:rPr>
-        <w:t>#!/</w:t>
-      </w:r>
-      <w:proofErr w:type="gramEnd"/>
-      <w:r>
-        <w:rPr>
-          <w:sz w:val="10"/>
-          <w:szCs w:val="12"/>
-          <w:lang w:val="en-GB"/>
-        </w:rPr>
-        <w:t>bin/sh</w:t>
-      </w:r>
-    </w:p>
-    <w:p>
-      <w:pPr>
-        <w:pStyle w:val="Code"/>
-        <w:rPr>
-          <w:sz w:val="10"/>
-          <w:szCs w:val="12"/>
-          <w:lang w:val="en-GB"/>
-        </w:rPr>
-      </w:pPr>
-      <w:r>
-        <w:rPr>
-          <w:sz w:val="10"/>
-          <w:szCs w:val="12"/>
-          <w:lang w:val="en-GB"/>
-        </w:rPr>
-        <w:t>curl -L "https://docs.google.com/spreadsheets/d/e/2PACX-1vTZw1cwlV6pdFETvC-JnI0gPwKRwR0rBUc2XqX9V3LV1NfrB0zvhhWKmrYVS1eippbs91lMLfkeXj6-/pub?gid=0&amp;single=true&amp;output=csv" -o /www/</w:t>
-      </w:r>
-      <w:proofErr w:type="spellStart"/>
-      <w:r>
-        <w:rPr>
-          <w:sz w:val="10"/>
-          <w:szCs w:val="12"/>
-          <w:lang w:val="en-GB"/>
-        </w:rPr>
-        <w:t>filerepo</w:t>
-      </w:r>
-      <w:proofErr w:type="spellEnd"/>
-      <w:r>
-        <w:rPr>
-          <w:sz w:val="10"/>
-          <w:szCs w:val="12"/>
-          <w:lang w:val="en-GB"/>
-        </w:rPr>
-        <w:t>/Phonebook/AREDN_PhonebookV2.csv</w:t>
-      </w:r>
-    </w:p>
-    <w:p>
-      <w:pPr>
-        <w:pStyle w:val="Code"/>
-        <w:rPr>
-          <w:sz w:val="10"/>
-          <w:szCs w:val="12"/>
-          <w:lang w:val="en-GB"/>
-        </w:rPr>
-      </w:pPr>
-      <w:r>
-        <w:rPr>
-          <w:sz w:val="10"/>
-          <w:szCs w:val="12"/>
-          <w:lang w:val="en-GB"/>
-        </w:rPr>
-        <w:t>curl -L "https://docs.google.com/spreadsheets/d/e/2PACX-1vTZw1cwlV6pdFETvC-JnI0gPwKRwR0rBUc2XqX9V3LV1NfrB0zvhhWKmrYVS1eippbs91lMLfkeXj6-/pub?gid=0&amp;single=true&amp;output=csv" -o /www/</w:t>
-      </w:r>
-      <w:proofErr w:type="spellStart"/>
-      <w:r>
-        <w:rPr>
-          <w:sz w:val="10"/>
-          <w:szCs w:val="12"/>
-          <w:lang w:val="en-GB"/>
-        </w:rPr>
-        <w:t>filerepo</w:t>
-      </w:r>
-      <w:proofErr w:type="spellEnd"/>
-      <w:r>
-        <w:rPr>
-          <w:sz w:val="10"/>
-          <w:szCs w:val="12"/>
-          <w:lang w:val="en-GB"/>
-        </w:rPr>
-        <w:t>/Phonebook/AREDN_Phonebook.csv</w:t>
-      </w:r>
-    </w:p>
-    <w:p/>
-    <w:p>
-      <w:r>
-        <w:t xml:space="preserve">Include the route to this phonebook repo (and eventually a backup server) to this file on all </w:t>
-      </w:r>
-      <w:r>
-        <w:t>routers with the appropriate phonebook software</w:t>
-      </w:r>
-      <w:r>
-        <w:t>:</w:t>
-      </w:r>
-    </w:p>
-    <w:p>
-      <w:pPr>
-        <w:pStyle w:val="Code"/>
-      </w:pPr>
-      <w:r>
-        <w:t>vi /</w:t>
-      </w:r>
-      <w:proofErr w:type="spellStart"/>
-      <w:r>
-        <w:t>etc</w:t>
-      </w:r>
-      <w:proofErr w:type="spellEnd"/>
-      <w:r>
-        <w:t>/</w:t>
-      </w:r>
-      <w:proofErr w:type="spellStart"/>
-      <w:r>
-        <w:t>phonebook.conf</w:t>
-      </w:r>
-      <w:proofErr w:type="spellEnd"/>
-    </w:p>
-    <w:p/>
+    <w:bookmarkEnd w:id="36"/>
     <w:p>
       <w:pPr>
         <w:pStyle w:val="Picture"/>
@@ -10852,10 +10359,10 @@
           <w:noProof/>
         </w:rPr>
         <w:drawing>
-          <wp:inline distT="0" distB="0" distL="0" distR="0" wp14:anchorId="7FC71F16" wp14:editId="364B2ADF">
-            <wp:extent cx="3737997" cy="2552700"/>
+          <wp:inline distT="0" distB="0" distL="0" distR="0" wp14:anchorId="1521C1DE" wp14:editId="070DC8CD">
+            <wp:extent cx="5943600" cy="2191385"/>
             <wp:effectExtent l="0" t="0" r="0" b="0"/>
-            <wp:docPr id="261112747" name="Grafik 1"/>
+            <wp:docPr id="1461587687" name="Grafik 2"/>
             <wp:cNvGraphicFramePr>
               <a:graphicFrameLocks xmlns:a="http://schemas.openxmlformats.org/drawingml/2006/main" noChangeAspect="1"/>
             </wp:cNvGraphicFramePr>
@@ -10863,11 +10370,17 @@
               <a:graphicData uri="http://schemas.openxmlformats.org/drawingml/2006/picture">
                 <pic:pic xmlns:pic="http://schemas.openxmlformats.org/drawingml/2006/picture">
                   <pic:nvPicPr>
-                    <pic:cNvPr id="261112747" name=""/>
+                    <pic:cNvPr id="1461587687" name=""/>
                     <pic:cNvPicPr/>
                   </pic:nvPicPr>
                   <pic:blipFill>
-                    <a:blip r:embed="rId73"/>
+                    <a:blip r:embed="rId71">
+                      <a:extLst>
+                        <a:ext uri="{28A0092B-C50C-407E-A947-70E740481C1C}">
+                          <a14:useLocalDpi xmlns:a14="http://schemas.microsoft.com/office/drawing/2010/main" val="0"/>
+                        </a:ext>
+                      </a:extLst>
+                    </a:blip>
                     <a:stretch>
                       <a:fillRect/>
                     </a:stretch>
@@ -10875,7 +10388,7 @@
                   <pic:spPr>
                     <a:xfrm>
                       <a:off x="0" y="0"/>
-                      <a:ext cx="3753002" cy="2562947"/>
+                      <a:ext cx="5943600" cy="2191385"/>
                     </a:xfrm>
                     <a:prstGeom prst="rect">
                       <a:avLst/>
@@ -10887,8 +10400,41 @@
           </wp:inline>
         </w:drawing>
       </w:r>
-      <w:bookmarkEnd w:id="38"/>
-    </w:p>
+    </w:p>
+    <w:p/>
+    <w:p>
+      <w:pPr>
+        <w:pStyle w:val="Code"/>
+        <w:rPr>
+          <w:sz w:val="18"/>
+          <w:szCs w:val="20"/>
+        </w:rPr>
+      </w:pPr>
+      <w:r>
+        <w:rPr>
+          <w:sz w:val="18"/>
+          <w:szCs w:val="20"/>
+        </w:rPr>
+        <w:t>PHONEBOOK_SERVER=hb9bla-vm-tunnelserver.local.mesh,80,/filerepo/Phonebook/AREDN_Phonebook.csv</w:t>
+      </w:r>
+    </w:p>
+    <w:p>
+      <w:pPr>
+        <w:pStyle w:val="Code"/>
+        <w:rPr>
+          <w:sz w:val="18"/>
+          <w:szCs w:val="20"/>
+        </w:rPr>
+      </w:pPr>
+      <w:r>
+        <w:rPr>
+          <w:sz w:val="18"/>
+          <w:szCs w:val="20"/>
+        </w:rPr>
+        <w:t>PHONEBOOK_SERVER=hb9edi-vm-gw.local.mesh,80,/filerepo/Phonebook/AREDN_Phonebook.csv</w:t>
+      </w:r>
+    </w:p>
+    <w:p/>
     <w:p>
       <w:r>
         <w:t>The second path is for backup</w:t>
@@ -11629,15 +11175,15 @@
     <w:lsdException w:name="Unresolved Mention" w:semiHidden="1" w:unhideWhenUsed="1"/>
     <w:lsdException w:name="Smart Link" w:semiHidden="1" w:unhideWhenUsed="1"/>
   </w:latentStyles>
-  <w:style w:type="paragraph" w:default="1" w:styleId="Normal">
+  <w:style w:type="paragraph" w:default="1" w:styleId="Standard">
     <w:name w:val="Normal"/>
     <w:qFormat/>
   </w:style>
-  <w:style w:type="paragraph" w:styleId="Heading1">
+  <w:style w:type="paragraph" w:styleId="berschrift1">
     <w:name w:val="heading 1"/>
-    <w:basedOn w:val="Normal"/>
-    <w:next w:val="Normal"/>
-    <w:link w:val="Heading1Char"/>
+    <w:basedOn w:val="Standard"/>
+    <w:next w:val="Standard"/>
+    <w:link w:val="berschrift1Zchn"/>
     <w:uiPriority w:val="9"/>
     <w:qFormat/>
     <w:rsid w:val="00940B79"/>
@@ -11655,11 +11201,11 @@
       <w:szCs w:val="32"/>
     </w:rPr>
   </w:style>
-  <w:style w:type="paragraph" w:styleId="Heading2">
+  <w:style w:type="paragraph" w:styleId="berschrift2">
     <w:name w:val="heading 2"/>
-    <w:basedOn w:val="Normal"/>
-    <w:next w:val="Normal"/>
-    <w:link w:val="Heading2Char"/>
+    <w:basedOn w:val="Standard"/>
+    <w:next w:val="Standard"/>
+    <w:link w:val="berschrift2Zchn"/>
     <w:uiPriority w:val="9"/>
     <w:unhideWhenUsed/>
     <w:qFormat/>
@@ -11677,11 +11223,11 @@
       <w:szCs w:val="26"/>
     </w:rPr>
   </w:style>
-  <w:style w:type="paragraph" w:styleId="Heading3">
+  <w:style w:type="paragraph" w:styleId="berschrift3">
     <w:name w:val="heading 3"/>
-    <w:basedOn w:val="Normal"/>
-    <w:next w:val="Normal"/>
-    <w:link w:val="Heading3Char"/>
+    <w:basedOn w:val="Standard"/>
+    <w:next w:val="Standard"/>
+    <w:link w:val="berschrift3Zchn"/>
     <w:uiPriority w:val="9"/>
     <w:unhideWhenUsed/>
     <w:qFormat/>
@@ -11699,13 +11245,12 @@
       <w:szCs w:val="24"/>
     </w:rPr>
   </w:style>
-  <w:style w:type="character" w:default="1" w:styleId="DefaultParagraphFont">
+  <w:style w:type="character" w:default="1" w:styleId="Absatz-Standardschriftart">
     <w:name w:val="Default Paragraph Font"/>
     <w:uiPriority w:val="1"/>
-    <w:semiHidden/>
     <w:unhideWhenUsed/>
   </w:style>
-  <w:style w:type="table" w:default="1" w:styleId="TableNormal">
+  <w:style w:type="table" w:default="1" w:styleId="NormaleTabelle">
     <w:name w:val="Normal Table"/>
     <w:uiPriority w:val="99"/>
     <w:semiHidden/>
@@ -11720,7 +11265,7 @@
       </w:tblCellMar>
     </w:tblPr>
   </w:style>
-  <w:style w:type="numbering" w:default="1" w:styleId="NoList">
+  <w:style w:type="numbering" w:default="1" w:styleId="KeineListe">
     <w:name w:val="No List"/>
     <w:uiPriority w:val="99"/>
     <w:semiHidden/>
@@ -11728,7 +11273,7 @@
   </w:style>
   <w:style w:type="paragraph" w:customStyle="1" w:styleId="Code">
     <w:name w:val="Code"/>
-    <w:basedOn w:val="Normal"/>
+    <w:basedOn w:val="Standard"/>
     <w:link w:val="CodeZchn"/>
     <w:qFormat/>
     <w:rsid w:val="00DC35CF"/>
@@ -11750,7 +11295,7 @@
   </w:style>
   <w:style w:type="character" w:customStyle="1" w:styleId="CodeZchn">
     <w:name w:val="Code Zchn"/>
-    <w:basedOn w:val="DefaultParagraphFont"/>
+    <w:basedOn w:val="Absatz-Standardschriftart"/>
     <w:link w:val="Code"/>
     <w:rsid w:val="00DC35CF"/>
     <w:rPr>
@@ -11759,11 +11304,11 @@
       <w:lang w:val="de-CH"/>
     </w:rPr>
   </w:style>
-  <w:style w:type="paragraph" w:styleId="Title">
+  <w:style w:type="paragraph" w:styleId="Titel">
     <w:name w:val="Title"/>
-    <w:basedOn w:val="Normal"/>
-    <w:next w:val="Normal"/>
-    <w:link w:val="TitleChar"/>
+    <w:basedOn w:val="Standard"/>
+    <w:next w:val="Standard"/>
+    <w:link w:val="TitelZchn"/>
     <w:uiPriority w:val="10"/>
     <w:qFormat/>
     <w:rsid w:val="00940B79"/>
@@ -11779,10 +11324,10 @@
       <w:szCs w:val="56"/>
     </w:rPr>
   </w:style>
-  <w:style w:type="character" w:customStyle="1" w:styleId="TitleChar">
-    <w:name w:val="Title Char"/>
-    <w:basedOn w:val="DefaultParagraphFont"/>
-    <w:link w:val="Title"/>
+  <w:style w:type="character" w:customStyle="1" w:styleId="TitelZchn">
+    <w:name w:val="Titel Zchn"/>
+    <w:basedOn w:val="Absatz-Standardschriftart"/>
+    <w:link w:val="Titel"/>
     <w:uiPriority w:val="10"/>
     <w:rsid w:val="00940B79"/>
     <w:rPr>
@@ -11793,10 +11338,10 @@
       <w:szCs w:val="56"/>
     </w:rPr>
   </w:style>
-  <w:style w:type="character" w:customStyle="1" w:styleId="Heading1Char">
-    <w:name w:val="Heading 1 Char"/>
-    <w:basedOn w:val="DefaultParagraphFont"/>
-    <w:link w:val="Heading1"/>
+  <w:style w:type="character" w:customStyle="1" w:styleId="berschrift1Zchn">
+    <w:name w:val="Überschrift 1 Zchn"/>
+    <w:basedOn w:val="Absatz-Standardschriftart"/>
+    <w:link w:val="berschrift1"/>
     <w:uiPriority w:val="9"/>
     <w:rsid w:val="00940B79"/>
     <w:rPr>
@@ -11806,10 +11351,10 @@
       <w:szCs w:val="32"/>
     </w:rPr>
   </w:style>
-  <w:style w:type="paragraph" w:styleId="TOCHeading">
+  <w:style w:type="paragraph" w:styleId="Inhaltsverzeichnisberschrift">
     <w:name w:val="TOC Heading"/>
-    <w:basedOn w:val="Heading1"/>
-    <w:next w:val="Normal"/>
+    <w:basedOn w:val="berschrift1"/>
+    <w:next w:val="Standard"/>
     <w:uiPriority w:val="39"/>
     <w:unhideWhenUsed/>
     <w:qFormat/>
@@ -11818,10 +11363,10 @@
       <w:outlineLvl w:val="9"/>
     </w:pPr>
   </w:style>
-  <w:style w:type="paragraph" w:styleId="TOC1">
+  <w:style w:type="paragraph" w:styleId="Verzeichnis1">
     <w:name w:val="toc 1"/>
-    <w:basedOn w:val="Normal"/>
-    <w:next w:val="Normal"/>
+    <w:basedOn w:val="Standard"/>
+    <w:next w:val="Standard"/>
     <w:autoRedefine/>
     <w:uiPriority w:val="39"/>
     <w:unhideWhenUsed/>
@@ -11832,7 +11377,7 @@
   </w:style>
   <w:style w:type="character" w:styleId="Hyperlink">
     <w:name w:val="Hyperlink"/>
-    <w:basedOn w:val="DefaultParagraphFont"/>
+    <w:basedOn w:val="Absatz-Standardschriftart"/>
     <w:uiPriority w:val="99"/>
     <w:unhideWhenUsed/>
     <w:rsid w:val="00940B79"/>
@@ -11841,10 +11386,10 @@
       <w:u w:val="single"/>
     </w:rPr>
   </w:style>
-  <w:style w:type="character" w:customStyle="1" w:styleId="Heading2Char">
-    <w:name w:val="Heading 2 Char"/>
-    <w:basedOn w:val="DefaultParagraphFont"/>
-    <w:link w:val="Heading2"/>
+  <w:style w:type="character" w:customStyle="1" w:styleId="berschrift2Zchn">
+    <w:name w:val="Überschrift 2 Zchn"/>
+    <w:basedOn w:val="Absatz-Standardschriftart"/>
+    <w:link w:val="berschrift2"/>
     <w:uiPriority w:val="9"/>
     <w:rsid w:val="008465AE"/>
     <w:rPr>
@@ -11854,10 +11399,10 @@
       <w:szCs w:val="26"/>
     </w:rPr>
   </w:style>
-  <w:style w:type="character" w:customStyle="1" w:styleId="Heading3Char">
-    <w:name w:val="Heading 3 Char"/>
-    <w:basedOn w:val="DefaultParagraphFont"/>
-    <w:link w:val="Heading3"/>
+  <w:style w:type="character" w:customStyle="1" w:styleId="berschrift3Zchn">
+    <w:name w:val="Überschrift 3 Zchn"/>
+    <w:basedOn w:val="Absatz-Standardschriftart"/>
+    <w:link w:val="berschrift3"/>
     <w:uiPriority w:val="9"/>
     <w:rsid w:val="00792E2A"/>
     <w:rPr>
@@ -11867,9 +11412,9 @@
       <w:szCs w:val="24"/>
     </w:rPr>
   </w:style>
-  <w:style w:type="character" w:styleId="UnresolvedMention">
+  <w:style w:type="character" w:styleId="NichtaufgelsteErwhnung">
     <w:name w:val="Unresolved Mention"/>
-    <w:basedOn w:val="DefaultParagraphFont"/>
+    <w:basedOn w:val="Absatz-Standardschriftart"/>
     <w:uiPriority w:val="99"/>
     <w:semiHidden/>
     <w:unhideWhenUsed/>
@@ -11879,9 +11424,9 @@
       <w:shd w:val="clear" w:color="auto" w:fill="E1DFDD"/>
     </w:rPr>
   </w:style>
-  <w:style w:type="character" w:styleId="FollowedHyperlink">
+  <w:style w:type="character" w:styleId="BesuchterLink">
     <w:name w:val="FollowedHyperlink"/>
-    <w:basedOn w:val="DefaultParagraphFont"/>
+    <w:basedOn w:val="Absatz-Standardschriftart"/>
     <w:uiPriority w:val="99"/>
     <w:semiHidden/>
     <w:unhideWhenUsed/>
@@ -11891,10 +11436,10 @@
       <w:u w:val="single"/>
     </w:rPr>
   </w:style>
-  <w:style w:type="paragraph" w:styleId="TOC2">
+  <w:style w:type="paragraph" w:styleId="Verzeichnis2">
     <w:name w:val="toc 2"/>
-    <w:basedOn w:val="Normal"/>
-    <w:next w:val="Normal"/>
+    <w:basedOn w:val="Standard"/>
+    <w:next w:val="Standard"/>
     <w:autoRedefine/>
     <w:uiPriority w:val="39"/>
     <w:unhideWhenUsed/>
@@ -11904,10 +11449,10 @@
       <w:ind w:left="220"/>
     </w:pPr>
   </w:style>
-  <w:style w:type="paragraph" w:styleId="ListParagraph">
+  <w:style w:type="paragraph" w:styleId="Listenabsatz">
     <w:name w:val="List Paragraph"/>
-    <w:basedOn w:val="Normal"/>
-    <w:link w:val="ListParagraphChar"/>
+    <w:basedOn w:val="Standard"/>
+    <w:link w:val="ListenabsatzZchn"/>
     <w:uiPriority w:val="34"/>
     <w:qFormat/>
     <w:rsid w:val="00A37910"/>
@@ -11918,7 +11463,7 @@
   </w:style>
   <w:style w:type="paragraph" w:customStyle="1" w:styleId="NumberedList">
     <w:name w:val="Numbered List"/>
-    <w:basedOn w:val="ListParagraph"/>
+    <w:basedOn w:val="Listenabsatz"/>
     <w:link w:val="NumberedListZchn"/>
     <w:qFormat/>
     <w:rsid w:val="00A37910"/>
@@ -11931,20 +11476,20 @@
       <w:contextualSpacing w:val="0"/>
     </w:pPr>
   </w:style>
-  <w:style w:type="character" w:customStyle="1" w:styleId="ListParagraphChar">
-    <w:name w:val="List Paragraph Char"/>
-    <w:basedOn w:val="DefaultParagraphFont"/>
-    <w:link w:val="ListParagraph"/>
+  <w:style w:type="character" w:customStyle="1" w:styleId="ListenabsatzZchn">
+    <w:name w:val="Listenabsatz Zchn"/>
+    <w:basedOn w:val="Absatz-Standardschriftart"/>
+    <w:link w:val="Listenabsatz"/>
     <w:uiPriority w:val="34"/>
     <w:rsid w:val="00A37910"/>
   </w:style>
   <w:style w:type="character" w:customStyle="1" w:styleId="NumberedListZchn">
     <w:name w:val="Numbered List Zchn"/>
-    <w:basedOn w:val="ListParagraphChar"/>
+    <w:basedOn w:val="ListenabsatzZchn"/>
     <w:link w:val="NumberedList"/>
     <w:rsid w:val="00A37910"/>
   </w:style>
-  <w:style w:type="paragraph" w:styleId="NoSpacing">
+  <w:style w:type="paragraph" w:styleId="KeinLeerraum">
     <w:name w:val="No Spacing"/>
     <w:uiPriority w:val="1"/>
     <w:qFormat/>
@@ -11953,10 +11498,10 @@
       <w:spacing w:after="0" w:line="240" w:lineRule="auto"/>
     </w:pPr>
   </w:style>
-  <w:style w:type="paragraph" w:styleId="TOC3">
+  <w:style w:type="paragraph" w:styleId="Verzeichnis3">
     <w:name w:val="toc 3"/>
-    <w:basedOn w:val="Normal"/>
-    <w:next w:val="Normal"/>
+    <w:basedOn w:val="Standard"/>
+    <w:next w:val="Standard"/>
     <w:autoRedefine/>
     <w:uiPriority w:val="39"/>
     <w:unhideWhenUsed/>
@@ -11968,7 +11513,7 @@
   </w:style>
   <w:style w:type="paragraph" w:customStyle="1" w:styleId="Picture">
     <w:name w:val="Picture"/>
-    <w:basedOn w:val="Heading2"/>
+    <w:basedOn w:val="berschrift2"/>
     <w:link w:val="PictureZchn"/>
     <w:qFormat/>
     <w:rsid w:val="00C15127"/>
@@ -11982,7 +11527,7 @@
   </w:style>
   <w:style w:type="character" w:customStyle="1" w:styleId="PictureZchn">
     <w:name w:val="Picture Zchn"/>
-    <w:basedOn w:val="Heading2Char"/>
+    <w:basedOn w:val="berschrift2Zchn"/>
     <w:link w:val="Picture"/>
     <w:rsid w:val="00C15127"/>
     <w:rPr>

</xml_diff>

<commit_message>
setup doc: switch phonebook install to swissdigitalnet/AREDN-Phonebook, drop Pi section
HAP install section now:
- Points at swissdigitalnet/AREDN-Phonebook releases (was arednch/packages — retired project)
- Verify URL is http://localnode.local.mesh/arednstack/phonebook_generic_direct.xml (port 80)
- Dropped :8081/reload force-reload step (doesn't exist on this package; it auto-populates)

Entire 'Install phonebook on a Raspberry Pi' chapter removed — it relied on the
retired arednch phonebook-deb build. Pi hosting can be revisited separately if
needed.
</commit_message>
<xml_diff>
--- a/Documentation/AREDN SetupV2.3-English.docx
+++ b/Documentation/AREDN SetupV2.3-English.docx
@@ -7609,7 +7609,7 @@
         <w:rPr>
           <w:lang w:val="en-GB"/>
         </w:rPr>
-        <w:instrText>HYPERLINK "https://github.com/arednch/packages/releases"</w:instrText>
+        <w:instrText>HYPERLINK "https://github.com/swissdigitalnet/AREDN-Phonebook/releases"</w:instrText>
       </w:r>
       <w:r>
         <w:fldChar w:fldCharType="separate"/>
@@ -7621,7 +7621,7 @@
           <w:u w:val="none"/>
           <w:lang w:val="en-GB"/>
         </w:rPr>
-        <w:t>https://github.com/arednch/packages/releases</w:t>
+        <w:t>https://github.com/swissdigitalnet/AREDN-Phonebook/releases</w:t>
       </w:r>
       <w:r>
         <w:fldChar w:fldCharType="end"/>
@@ -7993,43 +7993,10 @@
         </w:rPr>
       </w:pPr>
       <w:r>
-        <w:fldChar w:fldCharType="begin"/>
-      </w:r>
-      <w:r>
         <w:rPr>
           <w:lang w:val="en-US"/>
         </w:rPr>
-        <w:instrText>HYPERLINK "http://localnode.local.mesh:8081/phonebook?format=direct&amp;target=generic&amp;ia"</w:instrText>
-      </w:r>
-      <w:r>
-        <w:fldChar w:fldCharType="separate"/>
-      </w:r>
-      <w:r>
-        <w:rPr>
-          <w:rStyle w:val="Hyperlink"/>
-          <w:lang w:val="en-US"/>
-        </w:rPr>
-        <w:t>localnode.local.mesh:8081/phonebook?format=direct&amp;target=generic&amp;ia</w:t>
-      </w:r>
-      <w:r>
-        <w:rPr>
-          <w:rStyle w:val="Hyperlink"/>
-        </w:rPr>
-        <w:fldChar w:fldCharType="end"/>
-      </w:r>
-      <w:r>
-        <w:rPr>
-          <w:rStyle w:val="Hyperlink"/>
-          <w:lang w:val="en-US"/>
-        </w:rPr>
-        <w:t>=</w:t>
-      </w:r>
-      <w:r>
-        <w:rPr>
-          <w:rStyle w:val="Hyperlink"/>
-          <w:lang w:val="en-US"/>
-        </w:rPr>
-        <w:t>true</w:t>
+        <w:t>http://localnode.local.mesh/arednstack/phonebook_generic_direct.xml</w:t>
       </w:r>
     </w:p>
     <w:p>
@@ -8119,53 +8086,6 @@
     <w:bookmarkEnd w:id="29"/>
     <w:p>
       <w:pPr>
-        <w:pStyle w:val="Code"/>
-        <w:rPr>
-          <w:lang w:val="en-GB"/>
-        </w:rPr>
-      </w:pPr>
-      <w:r>
-        <w:fldChar w:fldCharType="begin"/>
-      </w:r>
-      <w:r>
-        <w:rPr>
-          <w:lang w:val="en-US"/>
-        </w:rPr>
-        <w:instrText>HYPERLINK "localnode.local.mesh:8081/reload"</w:instrText>
-      </w:r>
-      <w:r>
-        <w:fldChar w:fldCharType="separate"/>
-      </w:r>
-      <w:r>
-        <w:rPr>
-          <w:rStyle w:val="Hyperlink"/>
-          <w:lang w:val="en-GB"/>
-        </w:rPr>
-        <w:t>localnode.local.mesh:8081/reload</w:t>
-      </w:r>
-      <w:r>
-        <w:rPr>
-          <w:rStyle w:val="Hyperlink"/>
-          <w:lang w:val="en-GB"/>
-        </w:rPr>
-        <w:fldChar w:fldCharType="end"/>
-      </w:r>
-    </w:p>
-    <w:p>
-      <w:pPr>
-        <w:rPr>
-          <w:lang w:val="en-GB"/>
-        </w:rPr>
-      </w:pPr>
-      <w:r>
-        <w:rPr>
-          <w:lang w:val="en-GB"/>
-        </w:rPr>
-        <w:t>should load the actual telephone book from the AREDN server</w:t>
-      </w:r>
-    </w:p>
-    <w:p>
-      <w:pPr>
         <w:pStyle w:val="Picture"/>
       </w:pPr>
       <w:r>
@@ -8605,1460 +8525,6 @@
           <w:lang w:val="en-GB"/>
         </w:rPr>
         <w:t>.</w:t>
-      </w:r>
-    </w:p>
-    <w:p>
-      <w:pPr>
-        <w:pStyle w:val="berschrift1"/>
-        <w:rPr>
-          <w:lang w:val="en-GB"/>
-        </w:rPr>
-      </w:pPr>
-      <w:bookmarkStart w:id="34" w:name="_Hlk182425744"/>
-      <w:r>
-        <w:rPr>
-          <w:lang w:val="en-GB"/>
-        </w:rPr>
-        <w:lastRenderedPageBreak/>
-        <w:t xml:space="preserve">Install </w:t>
-      </w:r>
-      <w:r>
-        <w:rPr>
-          <w:lang w:val="en-GB"/>
-        </w:rPr>
-        <w:t>p</w:t>
-      </w:r>
-      <w:r>
-        <w:rPr>
-          <w:lang w:val="en-GB"/>
-        </w:rPr>
-        <w:t>honebook on a Raspberry Pi</w:t>
-      </w:r>
-      <w:r>
-        <w:rPr>
-          <w:lang w:val="en-GB"/>
-        </w:rPr>
-        <w:t xml:space="preserve"> (needed after 3.25.0)</w:t>
-      </w:r>
-    </w:p>
-    <w:p>
-      <w:pPr>
-        <w:pStyle w:val="berschrift2"/>
-        <w:rPr>
-          <w:lang w:val="en-GB"/>
-        </w:rPr>
-      </w:pPr>
-      <w:r>
-        <w:rPr>
-          <w:lang w:val="en-GB"/>
-        </w:rPr>
-        <w:t>Hardware</w:t>
-      </w:r>
-    </w:p>
-    <w:p>
-      <w:pPr>
-        <w:rPr>
-          <w:lang w:val="en-GB"/>
-        </w:rPr>
-      </w:pPr>
-      <w:r>
-        <w:rPr>
-          <w:lang w:val="en-GB"/>
-        </w:rPr>
-        <w:t>With each release, the memory of the HAP Lite routers is more used. From AREDN 3.25.0 onwards, the phonebook no longer has sufficient space. Therefore, we need a solution.</w:t>
-      </w:r>
-    </w:p>
-    <w:p>
-      <w:pPr>
-        <w:rPr>
-          <w:lang w:val="en-GB"/>
-        </w:rPr>
-      </w:pPr>
-      <w:r>
-        <w:rPr>
-          <w:lang w:val="en-GB"/>
-        </w:rPr>
-        <w:t>Martin created a version of the phonebook for the Raspberry Pi</w:t>
-      </w:r>
-      <w:r>
-        <w:rPr>
-          <w:lang w:val="en-GB"/>
-        </w:rPr>
-        <w:t>. So we can use any Raspberry to host it. My preferred solution is a Pi Zero because it is quite small. But because it has no Ethernet connector, we either have to connect it via Wi-Fi to the HAP lite, or we use one of these small USB-RJ45 cables</w:t>
-      </w:r>
-      <w:r>
-        <w:rPr>
-          <w:lang w:val="en-GB"/>
-        </w:rPr>
-        <w:t>:</w:t>
-      </w:r>
-    </w:p>
-    <w:p>
-      <w:pPr>
-        <w:rPr>
-          <w:lang w:val="en-GB"/>
-        </w:rPr>
-      </w:pPr>
-      <w:r>
-        <w:rPr>
-          <w:noProof/>
-          <w:lang w:val="en-GB"/>
-        </w:rPr>
-        <w:drawing>
-          <wp:inline distT="0" distB="0" distL="0" distR="0" wp14:anchorId="1BFB76C4" wp14:editId="6CE26AC2">
-            <wp:extent cx="1624031" cy="1160870"/>
-            <wp:effectExtent l="0" t="0" r="0" b="1270"/>
-            <wp:docPr id="1193537425" name="Grafik 1"/>
-            <wp:cNvGraphicFramePr>
-              <a:graphicFrameLocks xmlns:a="http://schemas.openxmlformats.org/drawingml/2006/main" noChangeAspect="1"/>
-            </wp:cNvGraphicFramePr>
-            <a:graphic xmlns:a="http://schemas.openxmlformats.org/drawingml/2006/main">
-              <a:graphicData uri="http://schemas.openxmlformats.org/drawingml/2006/picture">
-                <pic:pic xmlns:pic="http://schemas.openxmlformats.org/drawingml/2006/picture">
-                  <pic:nvPicPr>
-                    <pic:cNvPr id="1193537425" name=""/>
-                    <pic:cNvPicPr/>
-                  </pic:nvPicPr>
-                  <pic:blipFill>
-                    <a:blip r:embed="rId58" cstate="print">
-                      <a:extLst>
-                        <a:ext uri="{28A0092B-C50C-407E-A947-70E740481C1C}">
-                          <a14:useLocalDpi xmlns:a14="http://schemas.microsoft.com/office/drawing/2010/main" val="0"/>
-                        </a:ext>
-                      </a:extLst>
-                    </a:blip>
-                    <a:stretch>
-                      <a:fillRect/>
-                    </a:stretch>
-                  </pic:blipFill>
-                  <pic:spPr>
-                    <a:xfrm>
-                      <a:off x="0" y="0"/>
-                      <a:ext cx="1638487" cy="1171203"/>
-                    </a:xfrm>
-                    <a:prstGeom prst="rect">
-                      <a:avLst/>
-                    </a:prstGeom>
-                  </pic:spPr>
-                </pic:pic>
-              </a:graphicData>
-            </a:graphic>
-          </wp:inline>
-        </w:drawing>
-      </w:r>
-    </w:p>
-    <w:p>
-      <w:pPr>
-        <w:rPr>
-          <w:lang w:val="en-GB"/>
-        </w:rPr>
-      </w:pPr>
-      <w:r>
-        <w:rPr>
-          <w:lang w:val="en-GB"/>
-        </w:rPr>
-        <w:t xml:space="preserve">Or you use an old Pi3. </w:t>
-      </w:r>
-    </w:p>
-    <w:p>
-      <w:pPr>
-        <w:pStyle w:val="berschrift2"/>
-        <w:rPr>
-          <w:lang w:val="en-GB"/>
-        </w:rPr>
-      </w:pPr>
-      <w:r>
-        <w:rPr>
-          <w:lang w:val="en-GB"/>
-        </w:rPr>
-        <w:t>Software installation</w:t>
-      </w:r>
-    </w:p>
-    <w:p>
-      <w:pPr>
-        <w:rPr>
-          <w:lang w:val="en-GB"/>
-        </w:rPr>
-      </w:pPr>
-      <w:r>
-        <w:rPr>
-          <w:lang w:val="en-GB"/>
-        </w:rPr>
-        <w:t>Next, we</w:t>
-      </w:r>
-      <w:r>
-        <w:rPr>
-          <w:lang w:val="en-GB"/>
-        </w:rPr>
-        <w:t xml:space="preserve"> need</w:t>
-      </w:r>
-      <w:r>
-        <w:rPr>
-          <w:lang w:val="en-GB"/>
-        </w:rPr>
-        <w:t xml:space="preserve"> to create an SD card using Pi Imager. </w:t>
-      </w:r>
-      <w:r>
-        <w:rPr>
-          <w:lang w:val="en-GB"/>
-        </w:rPr>
-        <w:t xml:space="preserve">I prepared a version with everything installed. </w:t>
-      </w:r>
-    </w:p>
-    <w:p>
-      <w:pPr>
-        <w:rPr>
-          <w:lang w:val="en-GB"/>
-        </w:rPr>
-      </w:pPr>
-      <w:r>
-        <w:rPr>
-          <w:lang w:val="en-GB"/>
-        </w:rPr>
-        <w:t>You can download it from here:</w:t>
-      </w:r>
-    </w:p>
-    <w:p>
-      <w:pPr>
-        <w:pStyle w:val="Code"/>
-        <w:rPr>
-          <w:lang w:val="en-GB"/>
-        </w:rPr>
-      </w:pPr>
-      <w:r>
-        <w:rPr>
-          <w:lang w:val="en-GB"/>
-        </w:rPr>
-        <w:t>https://drive.google.com/file/d/13LI0mwhcDH-T6AzRpbhtvQxxWXn5o5lF/view?usp=sharing</w:t>
-      </w:r>
-    </w:p>
-    <w:p>
-      <w:pPr>
-        <w:rPr>
-          <w:lang w:val="en-GB"/>
-        </w:rPr>
-      </w:pPr>
-      <w:r>
-        <w:rPr>
-          <w:lang w:val="en-GB"/>
-        </w:rPr>
-        <w:t>The username is Pi, and the password</w:t>
-      </w:r>
-      <w:r>
-        <w:rPr>
-          <w:lang w:val="en-GB"/>
-        </w:rPr>
-        <w:t xml:space="preserve"> is</w:t>
-      </w:r>
-      <w:r>
-        <w:rPr>
-          <w:lang w:val="en-GB"/>
-        </w:rPr>
-        <w:t xml:space="preserve"> </w:t>
-      </w:r>
-      <w:r>
-        <w:rPr>
-          <w:lang w:val="en-GB"/>
-        </w:rPr>
-        <w:t>“</w:t>
-      </w:r>
-      <w:r>
-        <w:rPr>
-          <w:lang w:val="en-GB"/>
-        </w:rPr>
-        <w:t>raspberry</w:t>
-      </w:r>
-      <w:r>
-        <w:rPr>
-          <w:lang w:val="en-GB"/>
-        </w:rPr>
-        <w:t>”</w:t>
-      </w:r>
-      <w:r>
-        <w:rPr>
-          <w:lang w:val="en-GB"/>
-        </w:rPr>
-        <w:t>.</w:t>
-      </w:r>
-      <w:r>
-        <w:rPr>
-          <w:lang w:val="en-GB"/>
-        </w:rPr>
-        <w:t xml:space="preserve"> It is a 32bit Raspberry OS and should run on all </w:t>
-      </w:r>
-      <w:proofErr w:type="spellStart"/>
-      <w:r>
-        <w:rPr>
-          <w:lang w:val="en-GB"/>
-        </w:rPr>
-        <w:t>Pis</w:t>
-      </w:r>
-      <w:proofErr w:type="spellEnd"/>
-    </w:p>
-    <w:p>
-      <w:pPr>
-        <w:rPr>
-          <w:lang w:val="en-GB"/>
-        </w:rPr>
-      </w:pPr>
-      <w:r>
-        <w:rPr>
-          <w:lang w:val="en-GB"/>
-        </w:rPr>
-        <w:t>Select the file</w:t>
-      </w:r>
-      <w:r>
-        <w:rPr>
-          <w:lang w:val="en-GB"/>
-        </w:rPr>
-        <w:t xml:space="preserve"> in the Pi imager (Use custom)</w:t>
-      </w:r>
-    </w:p>
-    <w:p>
-      <w:pPr>
-        <w:rPr>
-          <w:lang w:val="en-GB"/>
-        </w:rPr>
-      </w:pPr>
-      <w:r>
-        <w:rPr>
-          <w:noProof/>
-          <w:lang w:val="en-GB"/>
-        </w:rPr>
-        <w:drawing>
-          <wp:inline distT="0" distB="0" distL="0" distR="0" wp14:anchorId="7D3DBD3E" wp14:editId="6583485D">
-            <wp:extent cx="2797079" cy="1977081"/>
-            <wp:effectExtent l="0" t="0" r="3810" b="4445"/>
-            <wp:docPr id="1943201266" name="Grafik 5"/>
-            <wp:cNvGraphicFramePr>
-              <a:graphicFrameLocks xmlns:a="http://schemas.openxmlformats.org/drawingml/2006/main" noChangeAspect="1"/>
-            </wp:cNvGraphicFramePr>
-            <a:graphic xmlns:a="http://schemas.openxmlformats.org/drawingml/2006/main">
-              <a:graphicData uri="http://schemas.openxmlformats.org/drawingml/2006/picture">
-                <pic:pic xmlns:pic="http://schemas.openxmlformats.org/drawingml/2006/picture">
-                  <pic:nvPicPr>
-                    <pic:cNvPr id="1943201266" name=""/>
-                    <pic:cNvPicPr/>
-                  </pic:nvPicPr>
-                  <pic:blipFill>
-                    <a:blip r:embed="rId59" cstate="print">
-                      <a:extLst>
-                        <a:ext uri="{28A0092B-C50C-407E-A947-70E740481C1C}">
-                          <a14:useLocalDpi xmlns:a14="http://schemas.microsoft.com/office/drawing/2010/main" val="0"/>
-                        </a:ext>
-                      </a:extLst>
-                    </a:blip>
-                    <a:stretch>
-                      <a:fillRect/>
-                    </a:stretch>
-                  </pic:blipFill>
-                  <pic:spPr>
-                    <a:xfrm>
-                      <a:off x="0" y="0"/>
-                      <a:ext cx="2824756" cy="1996644"/>
-                    </a:xfrm>
-                    <a:prstGeom prst="rect">
-                      <a:avLst/>
-                    </a:prstGeom>
-                  </pic:spPr>
-                </pic:pic>
-              </a:graphicData>
-            </a:graphic>
-          </wp:inline>
-        </w:drawing>
-      </w:r>
-    </w:p>
-    <w:p>
-      <w:pPr>
-        <w:rPr>
-          <w:lang w:val="en-GB"/>
-        </w:rPr>
-      </w:pPr>
-      <w:r>
-        <w:rPr>
-          <w:lang w:val="en-GB"/>
-        </w:rPr>
-        <w:t>When finished,</w:t>
-      </w:r>
-      <w:r>
-        <w:rPr>
-          <w:lang w:val="en-GB"/>
-        </w:rPr>
-        <w:t xml:space="preserve"> insert the </w:t>
-      </w:r>
-      <w:r>
-        <w:rPr>
-          <w:lang w:val="en-GB"/>
-        </w:rPr>
-        <w:t>ready-made SD card into the Pi, power it up, and connect it to ports 2</w:t>
-      </w:r>
-      <w:r>
-        <w:rPr>
-          <w:lang w:val="en-GB"/>
-        </w:rPr>
-        <w:t xml:space="preserve"> or</w:t>
-      </w:r>
-      <w:r>
-        <w:rPr>
-          <w:lang w:val="en-GB"/>
-        </w:rPr>
-        <w:t xml:space="preserve"> </w:t>
-      </w:r>
-      <w:r>
-        <w:rPr>
-          <w:lang w:val="en-GB"/>
-        </w:rPr>
-        <w:t>3</w:t>
-      </w:r>
-      <w:r>
-        <w:rPr>
-          <w:lang w:val="en-GB"/>
-        </w:rPr>
-        <w:t xml:space="preserve"> of the </w:t>
-      </w:r>
-      <w:r>
-        <w:rPr>
-          <w:lang w:val="en-GB"/>
-        </w:rPr>
-        <w:t>HAT Lite. Then, power up the Pi</w:t>
-      </w:r>
-      <w:r>
-        <w:rPr>
-          <w:lang w:val="en-GB"/>
-        </w:rPr>
-        <w:t>.</w:t>
-      </w:r>
-    </w:p>
-    <w:p>
-      <w:r>
-        <w:t>To proceed, we go to the home screen of your HAP router:</w:t>
-      </w:r>
-    </w:p>
-    <w:p>
-      <w:pPr>
-        <w:pStyle w:val="Code"/>
-        <w:rPr>
-          <w:lang w:val="en-GB"/>
-        </w:rPr>
-      </w:pPr>
-      <w:r>
-        <w:rPr>
-          <w:lang w:val="en-GB"/>
-        </w:rPr>
-        <w:t>http://localnode.local.mesh</w:t>
-      </w:r>
-    </w:p>
-    <w:p/>
-    <w:p>
-      <w:r>
-        <w:lastRenderedPageBreak/>
-        <w:t xml:space="preserve">On the screen, </w:t>
-      </w:r>
-      <w:r>
-        <w:t>log in.</w:t>
-      </w:r>
-    </w:p>
-    <w:p>
-      <w:pPr>
-        <w:pStyle w:val="Picture"/>
-      </w:pPr>
-      <w:r>
-        <w:rPr>
-          <w:noProof/>
-        </w:rPr>
-        <w:drawing>
-          <wp:inline distT="0" distB="0" distL="0" distR="0" wp14:anchorId="3F88E99C" wp14:editId="11ED743E">
-            <wp:extent cx="992654" cy="557819"/>
-            <wp:effectExtent l="0" t="0" r="0" b="0"/>
-            <wp:docPr id="1888453174" name="Grafik 3" descr="Ein Bild, das Text, Screenshot, Schrift, Design enthält.&#10;&#10;KI-generierte Inhalte können fehlerhaft sein."/>
-            <wp:cNvGraphicFramePr>
-              <a:graphicFrameLocks xmlns:a="http://schemas.openxmlformats.org/drawingml/2006/main" noChangeAspect="1"/>
-            </wp:cNvGraphicFramePr>
-            <a:graphic xmlns:a="http://schemas.openxmlformats.org/drawingml/2006/main">
-              <a:graphicData uri="http://schemas.openxmlformats.org/drawingml/2006/picture">
-                <pic:pic xmlns:pic="http://schemas.openxmlformats.org/drawingml/2006/picture">
-                  <pic:nvPicPr>
-                    <pic:cNvPr id="1888453174" name="Grafik 3" descr="Ein Bild, das Text, Screenshot, Schrift, Design enthält.&#10;&#10;KI-generierte Inhalte können fehlerhaft sein."/>
-                    <pic:cNvPicPr/>
-                  </pic:nvPicPr>
-                  <pic:blipFill>
-                    <a:blip r:embed="rId60">
-                      <a:extLst>
-                        <a:ext uri="{28A0092B-C50C-407E-A947-70E740481C1C}">
-                          <a14:useLocalDpi xmlns:a14="http://schemas.microsoft.com/office/drawing/2010/main" val="0"/>
-                        </a:ext>
-                      </a:extLst>
-                    </a:blip>
-                    <a:stretch>
-                      <a:fillRect/>
-                    </a:stretch>
-                  </pic:blipFill>
-                  <pic:spPr>
-                    <a:xfrm>
-                      <a:off x="0" y="0"/>
-                      <a:ext cx="1002954" cy="563607"/>
-                    </a:xfrm>
-                    <a:prstGeom prst="rect">
-                      <a:avLst/>
-                    </a:prstGeom>
-                  </pic:spPr>
-                </pic:pic>
-              </a:graphicData>
-            </a:graphic>
-          </wp:inline>
-        </w:drawing>
-      </w:r>
-    </w:p>
-    <w:p>
-      <w:pPr>
-        <w:rPr>
-          <w:lang w:val="en-GB"/>
-        </w:rPr>
-      </w:pPr>
-      <w:r>
-        <w:rPr>
-          <w:lang w:val="en-GB"/>
-        </w:rPr>
-        <w:t>Now</w:t>
-      </w:r>
-      <w:r>
-        <w:rPr>
-          <w:lang w:val="en-GB"/>
-        </w:rPr>
-        <w:t>,</w:t>
-      </w:r>
-      <w:r>
-        <w:rPr>
-          <w:lang w:val="en-GB"/>
-        </w:rPr>
-        <w:t xml:space="preserve"> you should see your Raspberry Pi</w:t>
-      </w:r>
-      <w:r>
-        <w:rPr>
-          <w:lang w:val="en-GB"/>
-        </w:rPr>
-        <w:t xml:space="preserve">. Its name is </w:t>
-      </w:r>
-      <w:proofErr w:type="spellStart"/>
-      <w:r>
-        <w:rPr>
-          <w:lang w:val="en-GB"/>
-        </w:rPr>
-        <w:t>PhoneBookServer</w:t>
-      </w:r>
-      <w:proofErr w:type="spellEnd"/>
-      <w:r>
-        <w:rPr>
-          <w:lang w:val="en-GB"/>
-        </w:rPr>
-        <w:t>:</w:t>
-      </w:r>
-    </w:p>
-    <w:p>
-      <w:pPr>
-        <w:pStyle w:val="Picture"/>
-      </w:pPr>
-      <w:r>
-        <w:rPr>
-          <w:noProof/>
-        </w:rPr>
-        <w:drawing>
-          <wp:inline distT="0" distB="0" distL="0" distR="0" wp14:anchorId="07585120" wp14:editId="0C20E87A">
-            <wp:extent cx="5943600" cy="1901190"/>
-            <wp:effectExtent l="0" t="0" r="0" b="3810"/>
-            <wp:docPr id="304487127" name="Grafik 2" descr="Ein Bild, das Text, Screenshot, Software, Computersymbol enthält.&#10;&#10;KI-generierte Inhalte können fehlerhaft sein."/>
-            <wp:cNvGraphicFramePr>
-              <a:graphicFrameLocks xmlns:a="http://schemas.openxmlformats.org/drawingml/2006/main" noChangeAspect="1"/>
-            </wp:cNvGraphicFramePr>
-            <a:graphic xmlns:a="http://schemas.openxmlformats.org/drawingml/2006/main">
-              <a:graphicData uri="http://schemas.openxmlformats.org/drawingml/2006/picture">
-                <pic:pic xmlns:pic="http://schemas.openxmlformats.org/drawingml/2006/picture">
-                  <pic:nvPicPr>
-                    <pic:cNvPr id="304487127" name="Grafik 2" descr="Ein Bild, das Text, Screenshot, Software, Computersymbol enthält.&#10;&#10;KI-generierte Inhalte können fehlerhaft sein."/>
-                    <pic:cNvPicPr/>
-                  </pic:nvPicPr>
-                  <pic:blipFill>
-                    <a:blip r:embed="rId61" cstate="print">
-                      <a:extLst>
-                        <a:ext uri="{28A0092B-C50C-407E-A947-70E740481C1C}">
-                          <a14:useLocalDpi xmlns:a14="http://schemas.microsoft.com/office/drawing/2010/main" val="0"/>
-                        </a:ext>
-                      </a:extLst>
-                    </a:blip>
-                    <a:stretch>
-                      <a:fillRect/>
-                    </a:stretch>
-                  </pic:blipFill>
-                  <pic:spPr>
-                    <a:xfrm>
-                      <a:off x="0" y="0"/>
-                      <a:ext cx="5943600" cy="1901190"/>
-                    </a:xfrm>
-                    <a:prstGeom prst="rect">
-                      <a:avLst/>
-                    </a:prstGeom>
-                  </pic:spPr>
-                </pic:pic>
-              </a:graphicData>
-            </a:graphic>
-          </wp:inline>
-        </w:drawing>
-      </w:r>
-    </w:p>
-    <w:p>
-      <w:r>
-        <w:t>I</w:t>
-      </w:r>
-      <w:r>
-        <w:t>f</w:t>
-      </w:r>
-      <w:r>
-        <w:t xml:space="preserve"> you click into this area:</w:t>
-      </w:r>
-    </w:p>
-    <w:p>
-      <w:r>
-        <w:rPr>
-          <w:noProof/>
-        </w:rPr>
-        <w:drawing>
-          <wp:inline distT="0" distB="0" distL="0" distR="0" wp14:anchorId="0A4715F9" wp14:editId="450FD9BC">
-            <wp:extent cx="3216287" cy="1577561"/>
-            <wp:effectExtent l="0" t="0" r="3175" b="3810"/>
-            <wp:docPr id="1157853088" name="Grafik 4"/>
-            <wp:cNvGraphicFramePr>
-              <a:graphicFrameLocks xmlns:a="http://schemas.openxmlformats.org/drawingml/2006/main" noChangeAspect="1"/>
-            </wp:cNvGraphicFramePr>
-            <a:graphic xmlns:a="http://schemas.openxmlformats.org/drawingml/2006/main">
-              <a:graphicData uri="http://schemas.openxmlformats.org/drawingml/2006/picture">
-                <pic:pic xmlns:pic="http://schemas.openxmlformats.org/drawingml/2006/picture">
-                  <pic:nvPicPr>
-                    <pic:cNvPr id="1157853088" name=""/>
-                    <pic:cNvPicPr/>
-                  </pic:nvPicPr>
-                  <pic:blipFill>
-                    <a:blip r:embed="rId62" cstate="print">
-                      <a:extLst>
-                        <a:ext uri="{28A0092B-C50C-407E-A947-70E740481C1C}">
-                          <a14:useLocalDpi xmlns:a14="http://schemas.microsoft.com/office/drawing/2010/main" val="0"/>
-                        </a:ext>
-                      </a:extLst>
-                    </a:blip>
-                    <a:stretch>
-                      <a:fillRect/>
-                    </a:stretch>
-                  </pic:blipFill>
-                  <pic:spPr>
-                    <a:xfrm>
-                      <a:off x="0" y="0"/>
-                      <a:ext cx="3227702" cy="1583160"/>
-                    </a:xfrm>
-                    <a:prstGeom prst="rect">
-                      <a:avLst/>
-                    </a:prstGeom>
-                  </pic:spPr>
-                </pic:pic>
-              </a:graphicData>
-            </a:graphic>
-          </wp:inline>
-        </w:drawing>
-      </w:r>
-    </w:p>
-    <w:p>
-      <w:r>
-        <w:t>You should see its address.</w:t>
-      </w:r>
-    </w:p>
-    <w:p>
-      <w:r>
-        <w:rPr>
-          <w:noProof/>
-        </w:rPr>
-        <w:drawing>
-          <wp:inline distT="0" distB="0" distL="0" distR="0" wp14:anchorId="2A648325" wp14:editId="6338AC6D">
-            <wp:extent cx="2605299" cy="1959429"/>
-            <wp:effectExtent l="0" t="0" r="5080" b="3175"/>
-            <wp:docPr id="1400383456" name="Grafik 5" descr="Ein Bild, das Text, Screenshot, Software, Webseite enthält.&#10;&#10;KI-generierte Inhalte können fehlerhaft sein."/>
-            <wp:cNvGraphicFramePr>
-              <a:graphicFrameLocks xmlns:a="http://schemas.openxmlformats.org/drawingml/2006/main" noChangeAspect="1"/>
-            </wp:cNvGraphicFramePr>
-            <a:graphic xmlns:a="http://schemas.openxmlformats.org/drawingml/2006/main">
-              <a:graphicData uri="http://schemas.openxmlformats.org/drawingml/2006/picture">
-                <pic:pic xmlns:pic="http://schemas.openxmlformats.org/drawingml/2006/picture">
-                  <pic:nvPicPr>
-                    <pic:cNvPr id="1400383456" name="Grafik 5" descr="Ein Bild, das Text, Screenshot, Software, Webseite enthält.&#10;&#10;KI-generierte Inhalte können fehlerhaft sein."/>
-                    <pic:cNvPicPr/>
-                  </pic:nvPicPr>
-                  <pic:blipFill>
-                    <a:blip r:embed="rId63">
-                      <a:extLst>
-                        <a:ext uri="{28A0092B-C50C-407E-A947-70E740481C1C}">
-                          <a14:useLocalDpi xmlns:a14="http://schemas.microsoft.com/office/drawing/2010/main" val="0"/>
-                        </a:ext>
-                      </a:extLst>
-                    </a:blip>
-                    <a:stretch>
-                      <a:fillRect/>
-                    </a:stretch>
-                  </pic:blipFill>
-                  <pic:spPr>
-                    <a:xfrm>
-                      <a:off x="0" y="0"/>
-                      <a:ext cx="2617072" cy="1968283"/>
-                    </a:xfrm>
-                    <a:prstGeom prst="rect">
-                      <a:avLst/>
-                    </a:prstGeom>
-                  </pic:spPr>
-                </pic:pic>
-              </a:graphicData>
-            </a:graphic>
-          </wp:inline>
-        </w:drawing>
-      </w:r>
-    </w:p>
-    <w:p>
-      <w:r>
-        <w:t>Press the + sign:</w:t>
-      </w:r>
-    </w:p>
-    <w:p>
-      <w:r>
-        <w:lastRenderedPageBreak/>
-        <w:t xml:space="preserve"> </w:t>
-      </w:r>
-      <w:r>
-        <w:rPr>
-          <w:noProof/>
-        </w:rPr>
-        <w:drawing>
-          <wp:inline distT="0" distB="0" distL="0" distR="0" wp14:anchorId="1D933E75" wp14:editId="63A66812">
-            <wp:extent cx="2248930" cy="1914972"/>
-            <wp:effectExtent l="0" t="0" r="0" b="9525"/>
-            <wp:docPr id="1530984910" name="Grafik 7"/>
-            <wp:cNvGraphicFramePr>
-              <a:graphicFrameLocks xmlns:a="http://schemas.openxmlformats.org/drawingml/2006/main" noChangeAspect="1"/>
-            </wp:cNvGraphicFramePr>
-            <a:graphic xmlns:a="http://schemas.openxmlformats.org/drawingml/2006/main">
-              <a:graphicData uri="http://schemas.openxmlformats.org/drawingml/2006/picture">
-                <pic:pic xmlns:pic="http://schemas.openxmlformats.org/drawingml/2006/picture">
-                  <pic:nvPicPr>
-                    <pic:cNvPr id="1530984910" name=""/>
-                    <pic:cNvPicPr/>
-                  </pic:nvPicPr>
-                  <pic:blipFill>
-                    <a:blip r:embed="rId64">
-                      <a:extLst>
-                        <a:ext uri="{28A0092B-C50C-407E-A947-70E740481C1C}">
-                          <a14:useLocalDpi xmlns:a14="http://schemas.microsoft.com/office/drawing/2010/main" val="0"/>
-                        </a:ext>
-                      </a:extLst>
-                    </a:blip>
-                    <a:stretch>
-                      <a:fillRect/>
-                    </a:stretch>
-                  </pic:blipFill>
-                  <pic:spPr>
-                    <a:xfrm>
-                      <a:off x="0" y="0"/>
-                      <a:ext cx="2258325" cy="1922972"/>
-                    </a:xfrm>
-                    <a:prstGeom prst="rect">
-                      <a:avLst/>
-                    </a:prstGeom>
-                  </pic:spPr>
-                </pic:pic>
-              </a:graphicData>
-            </a:graphic>
-          </wp:inline>
-        </w:drawing>
-      </w:r>
-    </w:p>
-    <w:p>
-      <w:r>
-        <w:t>And tick the “do not propagate”. Like that, nobody will see your phone server</w:t>
-      </w:r>
-      <w:r>
-        <w:t xml:space="preserve"> outside of your HAP router</w:t>
-      </w:r>
-      <w:r>
-        <w:t>.</w:t>
-      </w:r>
-    </w:p>
-    <w:p>
-      <w:pPr>
-        <w:rPr>
-          <w:lang w:val="en-GB"/>
-        </w:rPr>
-      </w:pPr>
-      <w:r>
-        <w:rPr>
-          <w:lang w:val="en-GB"/>
-        </w:rPr>
-        <w:t xml:space="preserve">If your PC is directly connected to your HAP router, you can </w:t>
-      </w:r>
-      <w:r>
-        <w:rPr>
-          <w:lang w:val="en-GB"/>
-        </w:rPr>
-        <w:t xml:space="preserve">type the following address in a different window on your browser </w:t>
-      </w:r>
-    </w:p>
-    <w:p>
-      <w:pPr>
-        <w:pStyle w:val="Code"/>
-        <w:rPr>
-          <w:lang w:val="en-US"/>
-        </w:rPr>
-      </w:pPr>
-      <w:hyperlink r:id="rId65" w:history="1">
-        <w:r>
-          <w:rPr>
-            <w:rStyle w:val="Hyperlink"/>
-            <w:lang w:val="en-US"/>
-          </w:rPr>
-          <w:t>http://phonebookserver:8081/reload</w:t>
-        </w:r>
-      </w:hyperlink>
-    </w:p>
-    <w:p/>
-    <w:p>
-      <w:r>
-        <w:t xml:space="preserve">Otherwise, use this line </w:t>
-      </w:r>
-      <w:r>
-        <w:rPr>
-          <w:lang w:val="en-GB"/>
-        </w:rPr>
-        <w:t>(IP address in our case is 10.51.55.236):</w:t>
-      </w:r>
-    </w:p>
-    <w:p>
-      <w:pPr>
-        <w:pStyle w:val="Code"/>
-        <w:rPr>
-          <w:lang w:val="en-US"/>
-        </w:rPr>
-      </w:pPr>
-      <w:r>
-        <w:rPr>
-          <w:lang w:val="en-US"/>
-        </w:rPr>
-        <w:t>http://&lt;node IP address&gt;:8081/reload</w:t>
-      </w:r>
-    </w:p>
-    <w:p/>
-    <w:p>
-      <w:pPr>
-        <w:rPr>
-          <w:lang w:val="en-GB"/>
-        </w:rPr>
-      </w:pPr>
-      <w:r>
-        <w:rPr>
-          <w:lang w:val="en-GB"/>
-        </w:rPr>
-        <w:t>Now you can check if your Pi downloaded the phonebook:</w:t>
-      </w:r>
-    </w:p>
-    <w:p>
-      <w:pPr>
-        <w:pStyle w:val="Code"/>
-        <w:rPr>
-          <w:sz w:val="18"/>
-          <w:szCs w:val="20"/>
-          <w:lang w:val="en-GB"/>
-        </w:rPr>
-      </w:pPr>
-      <w:hyperlink r:id="rId66" w:history="1">
-        <w:r>
-          <w:rPr>
-            <w:rStyle w:val="Hyperlink"/>
-            <w:sz w:val="18"/>
-            <w:szCs w:val="20"/>
-            <w:lang w:val="en-GB"/>
-          </w:rPr>
-          <w:t>http://phonebookserver:8081/phonebook?format=direct&amp;target=generic&amp;ia=true</w:t>
-        </w:r>
-      </w:hyperlink>
-    </w:p>
-    <w:p>
-      <w:pPr>
-        <w:pStyle w:val="Code"/>
-        <w:rPr>
-          <w:sz w:val="18"/>
-          <w:szCs w:val="20"/>
-          <w:lang w:val="en-GB"/>
-        </w:rPr>
-      </w:pPr>
-      <w:r>
-        <w:rPr>
-          <w:sz w:val="18"/>
-          <w:szCs w:val="20"/>
-          <w:lang w:val="en-GB"/>
-        </w:rPr>
-        <w:t>or</w:t>
-      </w:r>
-    </w:p>
-    <w:p>
-      <w:pPr>
-        <w:pStyle w:val="Code"/>
-        <w:rPr>
-          <w:sz w:val="18"/>
-          <w:szCs w:val="20"/>
-          <w:lang w:val="en-US"/>
-        </w:rPr>
-      </w:pPr>
-      <w:hyperlink r:id="rId67" w:history="1">
-        <w:r>
-          <w:rPr>
-            <w:rStyle w:val="Hyperlink"/>
-            <w:sz w:val="18"/>
-            <w:szCs w:val="20"/>
-            <w:lang w:val="en-GB"/>
-          </w:rPr>
-          <w:t>http://</w:t>
-        </w:r>
-        <w:r>
-          <w:rPr>
-            <w:rStyle w:val="Hyperlink"/>
-            <w:sz w:val="18"/>
-            <w:szCs w:val="20"/>
-            <w:lang w:val="en-US"/>
-          </w:rPr>
-          <w:t>phonebookserver.local.mesh:8081/phonebook?format=direct&amp;target=generic&amp;ia=true</w:t>
-        </w:r>
-      </w:hyperlink>
-    </w:p>
-    <w:p>
-      <w:pPr>
-        <w:rPr>
-          <w:lang w:val="en-GB"/>
-        </w:rPr>
-      </w:pPr>
-    </w:p>
-    <w:p>
-      <w:pPr>
-        <w:pStyle w:val="Picture"/>
-      </w:pPr>
-      <w:r>
-        <w:rPr>
-          <w:noProof/>
-        </w:rPr>
-        <w:drawing>
-          <wp:inline distT="0" distB="0" distL="0" distR="0" wp14:anchorId="7E2FFF04" wp14:editId="5F11B313">
-            <wp:extent cx="2673603" cy="1726416"/>
-            <wp:effectExtent l="0" t="0" r="0" b="7620"/>
-            <wp:docPr id="754917260" name="Grafik 8"/>
-            <wp:cNvGraphicFramePr>
-              <a:graphicFrameLocks xmlns:a="http://schemas.openxmlformats.org/drawingml/2006/main" noChangeAspect="1"/>
-            </wp:cNvGraphicFramePr>
-            <a:graphic xmlns:a="http://schemas.openxmlformats.org/drawingml/2006/main">
-              <a:graphicData uri="http://schemas.openxmlformats.org/drawingml/2006/picture">
-                <pic:pic xmlns:pic="http://schemas.openxmlformats.org/drawingml/2006/picture">
-                  <pic:nvPicPr>
-                    <pic:cNvPr id="754917260" name=""/>
-                    <pic:cNvPicPr/>
-                  </pic:nvPicPr>
-                  <pic:blipFill>
-                    <a:blip r:embed="rId68" cstate="print">
-                      <a:extLst>
-                        <a:ext uri="{28A0092B-C50C-407E-A947-70E740481C1C}">
-                          <a14:useLocalDpi xmlns:a14="http://schemas.microsoft.com/office/drawing/2010/main" val="0"/>
-                        </a:ext>
-                      </a:extLst>
-                    </a:blip>
-                    <a:stretch>
-                      <a:fillRect/>
-                    </a:stretch>
-                  </pic:blipFill>
-                  <pic:spPr>
-                    <a:xfrm>
-                      <a:off x="0" y="0"/>
-                      <a:ext cx="2684710" cy="1733588"/>
-                    </a:xfrm>
-                    <a:prstGeom prst="rect">
-                      <a:avLst/>
-                    </a:prstGeom>
-                  </pic:spPr>
-                </pic:pic>
-              </a:graphicData>
-            </a:graphic>
-          </wp:inline>
-        </w:drawing>
-      </w:r>
-    </w:p>
-    <w:p>
-      <w:pPr>
-        <w:pStyle w:val="berschrift2"/>
-      </w:pPr>
-      <w:r>
-        <w:t>Adjustments</w:t>
-      </w:r>
-      <w:r>
-        <w:t xml:space="preserve"> on the phone</w:t>
-      </w:r>
-    </w:p>
-    <w:p>
-      <w:r>
-        <w:t>The only thing you have to adjust</w:t>
-      </w:r>
-      <w:r>
-        <w:t xml:space="preserve"> is to replace “localhost” with “</w:t>
-      </w:r>
-      <w:proofErr w:type="spellStart"/>
-      <w:r>
-        <w:t>phonebookserver</w:t>
-      </w:r>
-      <w:proofErr w:type="spellEnd"/>
-      <w:r>
-        <w:t>” in these two places:</w:t>
-      </w:r>
-    </w:p>
-    <w:p>
-      <w:r>
-        <w:rPr>
-          <w:noProof/>
-        </w:rPr>
-        <w:lastRenderedPageBreak/>
-        <w:drawing>
-          <wp:inline distT="0" distB="0" distL="0" distR="0" wp14:anchorId="0348FE9E" wp14:editId="49B926C8">
-            <wp:extent cx="3838338" cy="3180982"/>
-            <wp:effectExtent l="0" t="0" r="0" b="635"/>
-            <wp:docPr id="1435931901" name="Grafik 11"/>
-            <wp:cNvGraphicFramePr>
-              <a:graphicFrameLocks xmlns:a="http://schemas.openxmlformats.org/drawingml/2006/main" noChangeAspect="1"/>
-            </wp:cNvGraphicFramePr>
-            <a:graphic xmlns:a="http://schemas.openxmlformats.org/drawingml/2006/main">
-              <a:graphicData uri="http://schemas.openxmlformats.org/drawingml/2006/picture">
-                <pic:pic xmlns:pic="http://schemas.openxmlformats.org/drawingml/2006/picture">
-                  <pic:nvPicPr>
-                    <pic:cNvPr id="1435931901" name=""/>
-                    <pic:cNvPicPr/>
-                  </pic:nvPicPr>
-                  <pic:blipFill>
-                    <a:blip r:embed="rId69" cstate="print">
-                      <a:extLst>
-                        <a:ext uri="{28A0092B-C50C-407E-A947-70E740481C1C}">
-                          <a14:useLocalDpi xmlns:a14="http://schemas.microsoft.com/office/drawing/2010/main" val="0"/>
-                        </a:ext>
-                      </a:extLst>
-                    </a:blip>
-                    <a:stretch>
-                      <a:fillRect/>
-                    </a:stretch>
-                  </pic:blipFill>
-                  <pic:spPr>
-                    <a:xfrm>
-                      <a:off x="0" y="0"/>
-                      <a:ext cx="3850584" cy="3191131"/>
-                    </a:xfrm>
-                    <a:prstGeom prst="rect">
-                      <a:avLst/>
-                    </a:prstGeom>
-                  </pic:spPr>
-                </pic:pic>
-              </a:graphicData>
-            </a:graphic>
-          </wp:inline>
-        </w:drawing>
-      </w:r>
-    </w:p>
-    <w:p>
-      <w:r>
-        <w:t>And:</w:t>
-      </w:r>
-    </w:p>
-    <w:p>
-      <w:r>
-        <w:rPr>
-          <w:noProof/>
-        </w:rPr>
-        <w:drawing>
-          <wp:inline distT="0" distB="0" distL="0" distR="0" wp14:anchorId="09B2BA76" wp14:editId="6F4BCB0A">
-            <wp:extent cx="4046111" cy="2111240"/>
-            <wp:effectExtent l="0" t="0" r="0" b="3810"/>
-            <wp:docPr id="1140628998" name="Grafik 10"/>
-            <wp:cNvGraphicFramePr>
-              <a:graphicFrameLocks xmlns:a="http://schemas.openxmlformats.org/drawingml/2006/main" noChangeAspect="1"/>
-            </wp:cNvGraphicFramePr>
-            <a:graphic xmlns:a="http://schemas.openxmlformats.org/drawingml/2006/main">
-              <a:graphicData uri="http://schemas.openxmlformats.org/drawingml/2006/picture">
-                <pic:pic xmlns:pic="http://schemas.openxmlformats.org/drawingml/2006/picture">
-                  <pic:nvPicPr>
-                    <pic:cNvPr id="1140628998" name=""/>
-                    <pic:cNvPicPr/>
-                  </pic:nvPicPr>
-                  <pic:blipFill>
-                    <a:blip r:embed="rId70" cstate="print">
-                      <a:extLst>
-                        <a:ext uri="{28A0092B-C50C-407E-A947-70E740481C1C}">
-                          <a14:useLocalDpi xmlns:a14="http://schemas.microsoft.com/office/drawing/2010/main" val="0"/>
-                        </a:ext>
-                      </a:extLst>
-                    </a:blip>
-                    <a:stretch>
-                      <a:fillRect/>
-                    </a:stretch>
-                  </pic:blipFill>
-                  <pic:spPr>
-                    <a:xfrm>
-                      <a:off x="0" y="0"/>
-                      <a:ext cx="4062476" cy="2119779"/>
-                    </a:xfrm>
-                    <a:prstGeom prst="rect">
-                      <a:avLst/>
-                    </a:prstGeom>
-                  </pic:spPr>
-                </pic:pic>
-              </a:graphicData>
-            </a:graphic>
-          </wp:inline>
-        </w:drawing>
-      </w:r>
-    </w:p>
-    <w:p>
-      <w:r>
-        <w:t>Now you can test if your phone registers and if you can refresh the phonebook. If so, you are done.</w:t>
-      </w:r>
-    </w:p>
-    <w:p>
-      <w:pPr>
-        <w:pStyle w:val="berschrift2"/>
-      </w:pPr>
-      <w:r>
-        <w:t>Installation of the package (for “professionals”)</w:t>
-      </w:r>
-    </w:p>
-    <w:p>
-      <w:r>
-        <w:t>Get the package from:</w:t>
-      </w:r>
-    </w:p>
-    <w:p>
-      <w:r>
-        <w:t>XXX???</w:t>
-      </w:r>
-    </w:p>
-    <w:p>
-      <w:r>
-        <w:t xml:space="preserve">For the </w:t>
-      </w:r>
-      <w:r>
-        <w:t>Raspberry Pi 1 and Pi Zero</w:t>
-      </w:r>
-      <w:r>
-        <w:t xml:space="preserve">, or if you want to use a </w:t>
-      </w:r>
-      <w:r>
-        <w:t>32-bit</w:t>
-      </w:r>
-      <w:r>
-        <w:t xml:space="preserve"> Raspberry OS, </w:t>
-      </w:r>
-      <w:r>
-        <w:t>you</w:t>
-      </w:r>
-      <w:r>
-        <w:t xml:space="preserve"> have to use</w:t>
-      </w:r>
-      <w:r>
-        <w:t>:</w:t>
-      </w:r>
-    </w:p>
-    <w:p>
-      <w:pPr>
-        <w:pStyle w:val="Code"/>
-        <w:rPr>
-          <w:lang w:val="en-US"/>
-        </w:rPr>
-      </w:pPr>
-      <w:r>
-        <w:rPr>
-          <w:lang w:val="en-US"/>
-        </w:rPr>
-        <w:t>phonebook_armv6.deb</w:t>
-      </w:r>
-    </w:p>
-    <w:p>
-      <w:r>
-        <w:t>otherwise</w:t>
-      </w:r>
-      <w:r>
-        <w:t>,</w:t>
-      </w:r>
-      <w:r>
-        <w:t xml:space="preserve"> this one: </w:t>
-      </w:r>
-    </w:p>
-    <w:p>
-      <w:pPr>
-        <w:pStyle w:val="Code"/>
-        <w:rPr>
-          <w:lang w:val="en-GB"/>
-        </w:rPr>
-      </w:pPr>
-      <w:r>
-        <w:rPr>
-          <w:lang w:val="en-GB"/>
-        </w:rPr>
-        <w:t>phonebook_arm64.deb</w:t>
-      </w:r>
-    </w:p>
-    <w:p>
-      <w:pPr>
-        <w:rPr>
-          <w:lang w:val="en-GB"/>
-        </w:rPr>
-      </w:pPr>
-    </w:p>
-    <w:p>
-      <w:pPr>
-        <w:rPr>
-          <w:lang w:val="en-GB"/>
-        </w:rPr>
-      </w:pPr>
-      <w:r>
-        <w:rPr>
-          <w:lang w:val="en-GB"/>
-        </w:rPr>
-        <w:lastRenderedPageBreak/>
-        <w:t xml:space="preserve">You can install it with: </w:t>
-      </w:r>
-    </w:p>
-    <w:p>
-      <w:pPr>
-        <w:pStyle w:val="Code"/>
-        <w:rPr>
-          <w:lang w:val="en-GB"/>
-        </w:rPr>
-      </w:pPr>
-      <w:r>
-        <w:rPr>
-          <w:lang w:val="en-GB"/>
-        </w:rPr>
-        <w:t>s</w:t>
-      </w:r>
-      <w:r>
-        <w:rPr>
-          <w:lang w:val="en-GB"/>
-        </w:rPr>
-        <w:t xml:space="preserve">udo </w:t>
-      </w:r>
-      <w:proofErr w:type="spellStart"/>
-      <w:r>
-        <w:rPr>
-          <w:lang w:val="en-GB"/>
-        </w:rPr>
-        <w:t>dpkg</w:t>
-      </w:r>
-      <w:proofErr w:type="spellEnd"/>
-      <w:r>
-        <w:rPr>
-          <w:lang w:val="en-GB"/>
-        </w:rPr>
-        <w:t xml:space="preserve"> -</w:t>
-      </w:r>
-      <w:proofErr w:type="spellStart"/>
-      <w:r>
-        <w:rPr>
-          <w:lang w:val="en-GB"/>
-        </w:rPr>
-        <w:t>i</w:t>
-      </w:r>
-      <w:proofErr w:type="spellEnd"/>
-      <w:r>
-        <w:rPr>
-          <w:lang w:val="en-GB"/>
-        </w:rPr>
-        <w:t xml:space="preserve"> phonebook_arm</w:t>
-      </w:r>
-      <w:r>
-        <w:rPr>
-          <w:lang w:val="en-GB"/>
-        </w:rPr>
-        <w:t>v</w:t>
-      </w:r>
-      <w:r>
-        <w:rPr>
-          <w:lang w:val="en-GB"/>
-        </w:rPr>
-        <w:t>6.deb</w:t>
-      </w:r>
-    </w:p>
-    <w:p>
-      <w:pPr>
-        <w:pStyle w:val="Code"/>
-        <w:rPr>
-          <w:lang w:val="en-GB"/>
-        </w:rPr>
-      </w:pPr>
-      <w:r>
-        <w:rPr>
-          <w:lang w:val="en-GB"/>
-        </w:rPr>
-        <w:t>or</w:t>
-      </w:r>
-    </w:p>
-    <w:p>
-      <w:pPr>
-        <w:pStyle w:val="Code"/>
-        <w:rPr>
-          <w:lang w:val="en-GB"/>
-        </w:rPr>
-      </w:pPr>
-      <w:r>
-        <w:rPr>
-          <w:lang w:val="en-GB"/>
-        </w:rPr>
-        <w:t xml:space="preserve">sudo </w:t>
-      </w:r>
-      <w:proofErr w:type="spellStart"/>
-      <w:r>
-        <w:rPr>
-          <w:lang w:val="en-GB"/>
-        </w:rPr>
-        <w:t>dpkg</w:t>
-      </w:r>
-      <w:proofErr w:type="spellEnd"/>
-      <w:r>
-        <w:rPr>
-          <w:lang w:val="en-GB"/>
-        </w:rPr>
-        <w:t xml:space="preserve"> -</w:t>
-      </w:r>
-      <w:proofErr w:type="spellStart"/>
-      <w:r>
-        <w:rPr>
-          <w:lang w:val="en-GB"/>
-        </w:rPr>
-        <w:t>i</w:t>
-      </w:r>
-      <w:proofErr w:type="spellEnd"/>
-      <w:r>
-        <w:rPr>
-          <w:lang w:val="en-GB"/>
-        </w:rPr>
-        <w:t xml:space="preserve"> phonebook_arm64.deb</w:t>
-      </w:r>
-    </w:p>
-    <w:p>
-      <w:pPr>
-        <w:rPr>
-          <w:lang w:val="en-GB"/>
-        </w:rPr>
-      </w:pPr>
-    </w:p>
-    <w:p>
-      <w:pPr>
-        <w:rPr>
-          <w:lang w:val="en-GB"/>
-        </w:rPr>
-      </w:pPr>
-      <w:r>
-        <w:rPr>
-          <w:lang w:val="en-GB"/>
-        </w:rPr>
-        <w:t>Uninstall for both:</w:t>
-      </w:r>
-    </w:p>
-    <w:p>
-      <w:pPr>
-        <w:pStyle w:val="Code"/>
-        <w:rPr>
-          <w:lang w:val="en-GB"/>
-        </w:rPr>
-      </w:pPr>
-      <w:proofErr w:type="spellStart"/>
-      <w:r>
-        <w:rPr>
-          <w:lang w:val="en-GB"/>
-        </w:rPr>
-        <w:t>dpkg</w:t>
-      </w:r>
-      <w:proofErr w:type="spellEnd"/>
-      <w:r>
-        <w:rPr>
-          <w:lang w:val="en-GB"/>
-        </w:rPr>
-        <w:t xml:space="preserve"> -r phonebook</w:t>
-      </w:r>
-    </w:p>
-    <w:p>
-      <w:pPr>
-        <w:rPr>
-          <w:lang w:val="en-GB"/>
-        </w:rPr>
-      </w:pPr>
-    </w:p>
-    <w:p>
-      <w:pPr>
-        <w:rPr>
-          <w:lang w:val="en-GB"/>
-        </w:rPr>
-      </w:pPr>
-      <w:r>
-        <w:rPr>
-          <w:lang w:val="en-GB"/>
-        </w:rPr>
-        <w:t>Now the phonebook should start at boot.</w:t>
-      </w:r>
-    </w:p>
-    <w:p>
-      <w:pPr>
-        <w:rPr>
-          <w:sz w:val="32"/>
-          <w:szCs w:val="32"/>
-          <w:lang w:val="en-GB"/>
-        </w:rPr>
-      </w:pPr>
-    </w:p>
-    <w:p>
-      <w:pPr>
-        <w:rPr>
-          <w:sz w:val="32"/>
-          <w:szCs w:val="32"/>
-          <w:lang w:val="en-GB"/>
-        </w:rPr>
-      </w:pPr>
-    </w:p>
-    <w:p>
-      <w:pPr>
-        <w:rPr>
-          <w:sz w:val="32"/>
-          <w:szCs w:val="32"/>
-          <w:lang w:val="en-GB"/>
-        </w:rPr>
-      </w:pPr>
-    </w:p>
-    <w:p>
-      <w:pPr>
-        <w:rPr>
-          <w:sz w:val="32"/>
-          <w:szCs w:val="32"/>
-          <w:lang w:val="en-GB"/>
-        </w:rPr>
-      </w:pPr>
-      <w:r>
-        <w:rPr>
-          <w:sz w:val="32"/>
-          <w:szCs w:val="32"/>
-          <w:lang w:val="en-GB"/>
-        </w:rPr>
-        <w:t>This is the end of the manual. The rest is for Administrators</w:t>
-      </w:r>
-    </w:p>
-    <w:p>
-      <w:pPr>
-        <w:rPr>
-          <w:lang w:val="en-GB"/>
-        </w:rPr>
-      </w:pPr>
-      <w:r>
-        <w:rPr>
-          <w:lang w:val="en-GB"/>
-        </w:rPr>
-        <w:t>------------------------------------------------------------------------------------------------------------------------------------------</w:t>
       </w:r>
     </w:p>
     <w:p>

</xml_diff>